<commit_message>
Integração das entregas, documentação completa e apresentação final
- Integra contribuições de cada integrante ao código:
  - Validações do módulo de Logística (Leonardo) em ViagemController
  - Créditos da fórmula de precificação (Vinícius) no FreteService
  - Paleta de cores e identidade visual (Diego) no style.css
- Adiciona documentação completa em docs/:
  - Diagramas UML (classes, DER, casos de uso, sequência)
  - Manual do usuário
  - Esqueleto do relatório final consolidado
  - Artefatos históricos das Etapas 1 (Diego, Vinícius)
- Inclui apresentação POO (PPTX) e documento de entrega (PDF)
- Atualiza relatório parcial com seção de integração das entregas
- Atualiza README com links pra toda a documentação
</commit_message>
<xml_diff>
--- a/Relatorio Parcial - Pedro Marcandali.docx
+++ b/Relatorio Parcial - Pedro Marcandali.docx
@@ -2,68 +2,16 @@
 <file path=word/document.xml><?xml version="1.0" encoding="utf-8"?>
 <w:document xmlns:wpc="http://schemas.microsoft.com/office/word/2010/wordprocessingCanvas" xmlns:mo="http://schemas.microsoft.com/office/mac/office/2008/main" xmlns:mc="http://schemas.openxmlformats.org/markup-compatibility/2006" xmlns:mv="urn:schemas-microsoft-com:mac:vml" xmlns:o="urn:schemas-microsoft-com:office:office" xmlns:r="http://schemas.openxmlformats.org/officeDocument/2006/relationships" xmlns:m="http://schemas.openxmlformats.org/officeDocument/2006/math" xmlns:v="urn:schemas-microsoft-com:vml" xmlns:wp14="http://schemas.microsoft.com/office/word/2010/wordprocessingDrawing" xmlns:wp="http://schemas.openxmlformats.org/drawingml/2006/wordprocessingDrawing" xmlns:w10="urn:schemas-microsoft-com:office:word" xmlns:w="http://schemas.openxmlformats.org/wordprocessingml/2006/main" xmlns:w14="http://schemas.microsoft.com/office/word/2010/wordml" xmlns:wpg="http://schemas.microsoft.com/office/word/2010/wordprocessingGroup" xmlns:wpi="http://schemas.microsoft.com/office/word/2010/wordprocessingInk" xmlns:wne="http://schemas.microsoft.com/office/word/2006/wordml" xmlns:wps="http://schemas.microsoft.com/office/word/2010/wordprocessingShape" mc:Ignorable="w14 wp14">
   <w:body>
-    <w:p/>
-    <w:p/>
-    <w:p/>
-    <w:p/>
-    <w:p/>
     <w:p>
       <w:pPr>
         <w:jc w:val="center"/>
       </w:pPr>
       <w:r>
         <w:rPr>
-          <w:rFonts w:ascii="Arial" w:hAnsi="Arial"/>
           <w:b/>
-          <w:sz w:val="28"/>
+          <w:sz w:val="32"/>
         </w:rPr>
         <w:t>PROJETO INTEGRADOR</w:t>
-      </w:r>
-    </w:p>
-    <w:p/>
-    <w:p>
-      <w:pPr>
-        <w:jc w:val="center"/>
-      </w:pPr>
-      <w:r>
-        <w:rPr>
-          <w:rFonts w:ascii="Arial" w:hAnsi="Arial"/>
-          <w:b/>
-          <w:color w:val="003366"/>
-          <w:sz w:val="36"/>
-        </w:rPr>
-        <w:t>RELATORIO PARCIAL DE DESENVOLVIMENTO</w:t>
-      </w:r>
-    </w:p>
-    <w:p/>
-    <w:p>
-      <w:pPr>
-        <w:jc w:val="center"/>
-      </w:pPr>
-      <w:r>
-        <w:rPr>
-          <w:rFonts w:ascii="Arial" w:hAnsi="Arial"/>
-          <w:sz w:val="26"/>
-        </w:rPr>
-        <w:t>Sistema de Gestao Logistica com Precificacao Inteligente</w:t>
-      </w:r>
-    </w:p>
-    <w:p/>
-    <w:p/>
-    <w:p/>
-    <w:p/>
-    <w:p/>
-    <w:p/>
-    <w:p>
-      <w:pPr>
-        <w:jc w:val="center"/>
-      </w:pPr>
-      <w:r>
-        <w:rPr>
-          <w:rFonts w:ascii="Arial" w:hAnsi="Arial"/>
-          <w:sz w:val="22"/>
-        </w:rPr>
-        <w:t>Aluno: Pedro Henrique Alves Marcandali</w:t>
       </w:r>
     </w:p>
     <w:p>
@@ -72,10 +20,10 @@
       </w:pPr>
       <w:r>
         <w:rPr>
-          <w:rFonts w:ascii="Arial" w:hAnsi="Arial"/>
-          <w:sz w:val="22"/>
+          <w:b/>
+          <w:sz w:val="32"/>
         </w:rPr>
-        <w:t>RA: 20241595</w:t>
+        <w:t>RELATORIO PARCIAL DE DESENVOLVIMENTO</w:t>
       </w:r>
     </w:p>
     <w:p>
@@ -84,57 +32,96 @@
       </w:pPr>
       <w:r>
         <w:rPr>
-          <w:rFonts w:ascii="Arial" w:hAnsi="Arial"/>
-          <w:sz w:val="22"/>
+          <w:i/>
+          <w:sz w:val="24"/>
         </w:rPr>
-        <w:t>Area: Backend e Estrutura do Sistema</w:t>
+        <w:t>Sistema de Gestao Logistica com Precificacao Inteligente (TransLog)</w:t>
+      </w:r>
+    </w:p>
+    <w:p/>
+    <w:p>
+      <w:pPr>
+        <w:jc w:val="both"/>
+      </w:pPr>
+      <w:r>
+        <w:rPr>
+          <w:b/>
+        </w:rPr>
+        <w:t>Aluno: Pedro Henrique Alves Marcandali</w:t>
       </w:r>
     </w:p>
     <w:p>
       <w:pPr>
-        <w:jc w:val="center"/>
+        <w:jc w:val="both"/>
       </w:pPr>
       <w:r>
         <w:rPr>
-          <w:rFonts w:ascii="Arial" w:hAnsi="Arial"/>
-          <w:sz w:val="22"/>
+          <w:b/>
         </w:rPr>
-        <w:t>Data: 26/04/2026</w:t>
+        <w:t>RA: 20241595</w:t>
+      </w:r>
+    </w:p>
+    <w:p>
+      <w:pPr>
+        <w:jc w:val="both"/>
+      </w:pPr>
+      <w:r>
+        <w:rPr>
+          <w:b/>
+        </w:rPr>
+        <w:t>Area: Backend, Estrutura e Integracao do Sistema</w:t>
+      </w:r>
+    </w:p>
+    <w:p>
+      <w:pPr>
+        <w:jc w:val="both"/>
+      </w:pPr>
+      <w:r>
+        <w:rPr>
+          <w:b/>
+        </w:rPr>
+        <w:t>Data: 28/04/2026 (atualizacao)</w:t>
       </w:r>
     </w:p>
     <w:p>
       <w:r>
-        <w:br w:type="page"/>
+        <w:rPr>
+          <w:b/>
+          <w:color w:val="2C3E50"/>
+          <w:sz w:val="26"/>
+        </w:rPr>
+        <w:t>1. Introducao</w:t>
       </w:r>
     </w:p>
     <w:p>
       <w:pPr>
-        <w:pStyle w:val="Heading1"/>
+        <w:jc w:val="both"/>
       </w:pPr>
       <w:r>
-        <w:t>1. Introducao</w:t>
+        <w:rPr>
+          <w:b w:val="0"/>
+        </w:rPr>
+        <w:t>Este relatorio apresenta o progresso do desenvolvimento do backend e da estrutura do Sistema de Gestao Logistica com Precificacao Inteligente (TransLog), conforme as responsabilidades atribuidas ao integrante Pedro Henrique Alves Marcandali no Projeto Integrador. Esta versao foi atualizada em 28/04/2026 para refletir a integracao das entregas dos demais integrantes do grupo (Gabriela, Leonardo e Diego) ao sistema consolidado, garantindo rastreabilidade entre os relatorios individuais e o codigo-fonte.</w:t>
       </w:r>
     </w:p>
     <w:p>
       <w:r>
-        <w:t>Este relatorio apresenta o progresso do desenvolvimento do backend e da estrutura do Sistema de Gestao Logistica com Precificacao Inteligente (TransLog), conforme as responsabilidades atribuidas ao integrante Pedro Henrique Alves Marcandali no Projeto Integrador.</w:t>
-      </w:r>
-    </w:p>
-    <w:p>
-      <w:r>
-        <w:t>O documento detalha as atividades realizadas ate a presente data (26/04/2026), as tecnologias utilizadas, a arquitetura implementada e as pendencias restantes para a conclusao do projeto.</w:t>
+        <w:rPr>
+          <w:b/>
+          <w:color w:val="2C3E50"/>
+          <w:sz w:val="26"/>
+        </w:rPr>
+        <w:t>2. Escopo de Responsabilidade</w:t>
       </w:r>
     </w:p>
     <w:p>
       <w:pPr>
-        <w:pStyle w:val="Heading1"/>
+        <w:jc w:val="both"/>
       </w:pPr>
       <w:r>
-        <w:t>2. Escopo de Responsabilidade</w:t>
-      </w:r>
-    </w:p>
-    <w:p>
-      <w:r>
+        <w:rPr>
+          <w:b w:val="0"/>
+        </w:rPr>
         <w:t>Conforme a divisao de responsabilidades definida pelo grupo, minha area de atuacao compreende:</w:t>
       </w:r>
     </w:p>
@@ -179,68 +166,111 @@
       </w:r>
     </w:p>
     <w:p>
+      <w:pPr>
+        <w:pStyle w:val="ListBullet"/>
+      </w:pPr>
       <w:r>
-        <w:t>Alem disso, tive duas tarefas compartilhadas no cronograma:</w:t>
+        <w:t>Consolidacao das entregas dos demais integrantes ao sistema unificado</w:t>
+      </w:r>
+    </w:p>
+    <w:p>
+      <w:r>
+        <w:rPr>
+          <w:b/>
+          <w:color w:val="2C3E50"/>
+          <w:sz w:val="26"/>
+        </w:rPr>
+        <w:t>3. Atividades Realizadas</w:t>
+      </w:r>
+    </w:p>
+    <w:p>
+      <w:r>
+        <w:rPr>
+          <w:b/>
+          <w:sz w:val="22"/>
+        </w:rPr>
+        <w:t>3.1 Estrutura do Projeto</w:t>
+      </w:r>
+    </w:p>
+    <w:p>
+      <w:pPr>
+        <w:jc w:val="both"/>
+      </w:pPr>
+      <w:r>
+        <w:rPr>
+          <w:b w:val="0"/>
+        </w:rPr>
+        <w:t>O projeto foi criado com Spring Boot 3.5.0 usando Maven como gerenciador de dependencias. A estrutura segue o padrao MVC em tres camadas: Model (entidades JPA), Controller (APIs REST) e Service (regras de negocio). O banco de dados utilizado e o H2 com persistencia em arquivo local para desenvolvimento, com script MySQL pronto para producao (transportadora_completo.sql).</w:t>
+      </w:r>
+    </w:p>
+    <w:p>
+      <w:r>
+        <w:rPr>
+          <w:b/>
+          <w:sz w:val="22"/>
+        </w:rPr>
+        <w:t>3.2 Entidades do Banco de Dados (Model)</w:t>
+      </w:r>
+    </w:p>
+    <w:p>
+      <w:pPr>
+        <w:jc w:val="both"/>
+      </w:pPr>
+      <w:r>
+        <w:rPr>
+          <w:b w:val="0"/>
+        </w:rPr>
+        <w:t>Foram criadas 8 entidades JPA que representam o modelo de dados do sistema, evolucao da modelagem inicial elaborada por Gabriela Andrade Brito (5 tabelas) para a versao consolidada (8 tabelas com normalizacao adequada):</w:t>
       </w:r>
     </w:p>
     <w:tbl>
       <w:tblPr>
         <w:tblStyle w:val="LightGrid-Accent1"/>
         <w:tblW w:type="auto" w:w="0"/>
-        <w:jc w:val="center"/>
         <w:tblLook w:firstColumn="1" w:firstRow="1" w:lastColumn="0" w:lastRow="0" w:noHBand="0" w:noVBand="1" w:val="04A0"/>
       </w:tblPr>
       <w:tblGrid>
-        <w:gridCol w:w="2880"/>
-        <w:gridCol w:w="2880"/>
-        <w:gridCol w:w="2880"/>
+        <w:gridCol w:w="3135"/>
+        <w:gridCol w:w="3135"/>
+        <w:gridCol w:w="3135"/>
       </w:tblGrid>
       <w:tr>
         <w:tc>
           <w:tcPr>
-            <w:tcW w:type="dxa" w:w="2880"/>
+            <w:tcW w:type="dxa" w:w="3135"/>
           </w:tcPr>
           <w:p>
-            <w:r/>
             <w:r>
               <w:rPr>
-                <w:rFonts w:ascii="Arial" w:hAnsi="Arial"/>
                 <w:b/>
-                <w:sz w:val="20"/>
               </w:rPr>
-              <w:t>Data</w:t>
+              <w:t>Entidade</w:t>
             </w:r>
           </w:p>
         </w:tc>
         <w:tc>
           <w:tcPr>
-            <w:tcW w:type="dxa" w:w="2880"/>
+            <w:tcW w:type="dxa" w:w="3135"/>
           </w:tcPr>
           <w:p>
-            <w:r/>
             <w:r>
               <w:rPr>
-                <w:rFonts w:ascii="Arial" w:hAnsi="Arial"/>
                 <w:b/>
-                <w:sz w:val="20"/>
               </w:rPr>
-              <w:t>Acao</w:t>
+              <w:t>Tabela</w:t>
             </w:r>
           </w:p>
         </w:tc>
         <w:tc>
           <w:tcPr>
-            <w:tcW w:type="dxa" w:w="2880"/>
+            <w:tcW w:type="dxa" w:w="3135"/>
           </w:tcPr>
           <w:p>
-            <w:r/>
             <w:r>
               <w:rPr>
-                <w:rFonts w:ascii="Arial" w:hAnsi="Arial"/>
                 <w:b/>
-                <w:sz w:val="20"/>
               </w:rPr>
-              <w:t>Parceiro</w:t>
+              <w:t>Descricao</w:t>
             </w:r>
           </w:p>
         </w:tc>
@@ -248,46 +278,31 @@
       <w:tr>
         <w:tc>
           <w:tcPr>
-            <w:tcW w:type="dxa" w:w="2880"/>
+            <w:tcW w:type="dxa" w:w="3135"/>
           </w:tcPr>
           <w:p>
-            <w:r/>
             <w:r>
-              <w:rPr>
-                <w:rFonts w:ascii="Arial" w:hAnsi="Arial"/>
-                <w:sz w:val="20"/>
-              </w:rPr>
-              <w:t>10/03/2026</w:t>
+              <w:t>Usuario</w:t>
             </w:r>
           </w:p>
         </w:tc>
         <w:tc>
           <w:tcPr>
-            <w:tcW w:type="dxa" w:w="2880"/>
+            <w:tcW w:type="dxa" w:w="3135"/>
           </w:tcPr>
           <w:p>
-            <w:r/>
             <w:r>
-              <w:rPr>
-                <w:rFonts w:ascii="Arial" w:hAnsi="Arial"/>
-                <w:sz w:val="20"/>
-              </w:rPr>
-              <w:t>Diagramas UML e estrutura inicial</w:t>
+              <w:t>usuarios</w:t>
             </w:r>
           </w:p>
         </w:tc>
         <w:tc>
           <w:tcPr>
-            <w:tcW w:type="dxa" w:w="2880"/>
+            <w:tcW w:type="dxa" w:w="3135"/>
           </w:tcPr>
           <w:p>
-            <w:r/>
             <w:r>
-              <w:rPr>
-                <w:rFonts w:ascii="Arial" w:hAnsi="Arial"/>
-                <w:sz w:val="20"/>
-              </w:rPr>
-              <w:t>Diego</w:t>
+              <w:t>Usuarios do sistema com perfis ADMIN/OPERADOR/CONSULTA</w:t>
             </w:r>
           </w:p>
         </w:tc>
@@ -295,46 +310,223 @@
       <w:tr>
         <w:tc>
           <w:tcPr>
-            <w:tcW w:type="dxa" w:w="2880"/>
+            <w:tcW w:type="dxa" w:w="3135"/>
           </w:tcPr>
           <w:p>
-            <w:r/>
             <w:r>
-              <w:rPr>
-                <w:rFonts w:ascii="Arial" w:hAnsi="Arial"/>
-                <w:sz w:val="20"/>
-              </w:rPr>
-              <w:t>17/03/2026</w:t>
+              <w:t>Cliente</w:t>
             </w:r>
           </w:p>
         </w:tc>
         <w:tc>
           <w:tcPr>
-            <w:tcW w:type="dxa" w:w="2880"/>
+            <w:tcW w:type="dxa" w:w="3135"/>
           </w:tcPr>
           <w:p>
-            <w:r/>
             <w:r>
-              <w:rPr>
-                <w:rFonts w:ascii="Arial" w:hAnsi="Arial"/>
-                <w:sz w:val="20"/>
-              </w:rPr>
-              <w:t>Modelos do banco e conexao</w:t>
+              <w:t>clientes</w:t>
             </w:r>
           </w:p>
         </w:tc>
         <w:tc>
           <w:tcPr>
-            <w:tcW w:type="dxa" w:w="2880"/>
+            <w:tcW w:type="dxa" w:w="3135"/>
           </w:tcPr>
           <w:p>
-            <w:r/>
             <w:r>
-              <w:rPr>
-                <w:rFonts w:ascii="Arial" w:hAnsi="Arial"/>
-                <w:sz w:val="20"/>
-              </w:rPr>
-              <w:t>Gabriela</w:t>
+              <w:t>Empresas/pessoas que contratam servicos de frete</w:t>
+            </w:r>
+          </w:p>
+        </w:tc>
+      </w:tr>
+      <w:tr>
+        <w:tc>
+          <w:tcPr>
+            <w:tcW w:type="dxa" w:w="3135"/>
+          </w:tcPr>
+          <w:p>
+            <w:r>
+              <w:t>Motorista</w:t>
+            </w:r>
+          </w:p>
+        </w:tc>
+        <w:tc>
+          <w:tcPr>
+            <w:tcW w:type="dxa" w:w="3135"/>
+          </w:tcPr>
+          <w:p>
+            <w:r>
+              <w:t>motoristas</w:t>
+            </w:r>
+          </w:p>
+        </w:tc>
+        <w:tc>
+          <w:tcPr>
+            <w:tcW w:type="dxa" w:w="3135"/>
+          </w:tcPr>
+          <w:p>
+            <w:r>
+              <w:t>Motoristas com CNH e validade</w:t>
+            </w:r>
+          </w:p>
+        </w:tc>
+      </w:tr>
+      <w:tr>
+        <w:tc>
+          <w:tcPr>
+            <w:tcW w:type="dxa" w:w="3135"/>
+          </w:tcPr>
+          <w:p>
+            <w:r>
+              <w:t>Veiculo</w:t>
+            </w:r>
+          </w:p>
+        </w:tc>
+        <w:tc>
+          <w:tcPr>
+            <w:tcW w:type="dxa" w:w="3135"/>
+          </w:tcPr>
+          <w:p>
+            <w:r>
+              <w:t>veiculos</w:t>
+            </w:r>
+          </w:p>
+        </w:tc>
+        <w:tc>
+          <w:tcPr>
+            <w:tcW w:type="dxa" w:w="3135"/>
+          </w:tcPr>
+          <w:p>
+            <w:r>
+              <w:t>Frota com placa, capacidade, tipo e status</w:t>
+            </w:r>
+          </w:p>
+        </w:tc>
+      </w:tr>
+      <w:tr>
+        <w:tc>
+          <w:tcPr>
+            <w:tcW w:type="dxa" w:w="3135"/>
+          </w:tcPr>
+          <w:p>
+            <w:r>
+              <w:t>Rota</w:t>
+            </w:r>
+          </w:p>
+        </w:tc>
+        <w:tc>
+          <w:tcPr>
+            <w:tcW w:type="dxa" w:w="3135"/>
+          </w:tcPr>
+          <w:p>
+            <w:r>
+              <w:t>rotas</w:t>
+            </w:r>
+          </w:p>
+        </w:tc>
+        <w:tc>
+          <w:tcPr>
+            <w:tcW w:type="dxa" w:w="3135"/>
+          </w:tcPr>
+          <w:p>
+            <w:r>
+              <w:t>Trajetos com origem, destino e custos</w:t>
+            </w:r>
+          </w:p>
+        </w:tc>
+      </w:tr>
+      <w:tr>
+        <w:tc>
+          <w:tcPr>
+            <w:tcW w:type="dxa" w:w="3135"/>
+          </w:tcPr>
+          <w:p>
+            <w:r>
+              <w:t>Carga</w:t>
+            </w:r>
+          </w:p>
+        </w:tc>
+        <w:tc>
+          <w:tcPr>
+            <w:tcW w:type="dxa" w:w="3135"/>
+          </w:tcPr>
+          <w:p>
+            <w:r>
+              <w:t>cargas</w:t>
+            </w:r>
+          </w:p>
+        </w:tc>
+        <w:tc>
+          <w:tcPr>
+            <w:tcW w:type="dxa" w:w="3135"/>
+          </w:tcPr>
+          <w:p>
+            <w:r>
+              <w:t>Cargas com peso, volume e tipo</w:t>
+            </w:r>
+          </w:p>
+        </w:tc>
+      </w:tr>
+      <w:tr>
+        <w:tc>
+          <w:tcPr>
+            <w:tcW w:type="dxa" w:w="3135"/>
+          </w:tcPr>
+          <w:p>
+            <w:r>
+              <w:t>Viagem</w:t>
+            </w:r>
+          </w:p>
+        </w:tc>
+        <w:tc>
+          <w:tcPr>
+            <w:tcW w:type="dxa" w:w="3135"/>
+          </w:tcPr>
+          <w:p>
+            <w:r>
+              <w:t>viagens</w:t>
+            </w:r>
+          </w:p>
+        </w:tc>
+        <w:tc>
+          <w:tcPr>
+            <w:tcW w:type="dxa" w:w="3135"/>
+          </w:tcPr>
+          <w:p>
+            <w:r>
+              <w:t>Operacoes de transporte (veiculo+rota+carga+motorista)</w:t>
+            </w:r>
+          </w:p>
+        </w:tc>
+      </w:tr>
+      <w:tr>
+        <w:tc>
+          <w:tcPr>
+            <w:tcW w:type="dxa" w:w="3135"/>
+          </w:tcPr>
+          <w:p>
+            <w:r>
+              <w:t>Frete</w:t>
+            </w:r>
+          </w:p>
+        </w:tc>
+        <w:tc>
+          <w:tcPr>
+            <w:tcW w:type="dxa" w:w="3135"/>
+          </w:tcPr>
+          <w:p>
+            <w:r>
+              <w:t>fretes</w:t>
+            </w:r>
+          </w:p>
+        </w:tc>
+        <w:tc>
+          <w:tcPr>
+            <w:tcW w:type="dxa" w:w="3135"/>
+          </w:tcPr>
+          <w:p>
+            <w:r>
+              <w:t>Calculos de precificacao com custos discriminados</w:t>
             </w:r>
           </w:p>
         </w:tc>
@@ -342,516 +534,43 @@
     </w:tbl>
     <w:p/>
     <w:p>
-      <w:pPr>
-        <w:pStyle w:val="Heading1"/>
-      </w:pPr>
       <w:r>
-        <w:t>3. Atividades Realizadas</w:t>
+        <w:rPr>
+          <w:b/>
+          <w:sz w:val="22"/>
+        </w:rPr>
+        <w:t>3.3 Repositories</w:t>
       </w:r>
     </w:p>
     <w:p>
       <w:pPr>
-        <w:pStyle w:val="Heading2"/>
+        <w:jc w:val="both"/>
       </w:pPr>
       <w:r>
-        <w:t>3.1 Estrutura do Projeto</w:t>
+        <w:rPr>
+          <w:b w:val="0"/>
+        </w:rPr>
+        <w:t>Para cada entidade foi criada uma interface que estende JpaRepository, fornecendo operacoes CRUD automaticas e consultas personalizadas (ex: buscar veiculos por status, buscar usuario por email).</w:t>
       </w:r>
     </w:p>
     <w:p>
       <w:r>
-        <w:t>O projeto foi criado com Spring Boot 3.5.0 usando Maven como gerenciador de dependencias. A estrutura segue o padrao MVC em tres camadas: Model (entidades JPA), Controller (APIs REST) e Service (regras de negocio). O banco de dados utilizado e o H2 com persistencia em arquivo local.</w:t>
+        <w:rPr>
+          <w:b/>
+          <w:sz w:val="22"/>
+        </w:rPr>
+        <w:t>3.4 Servico de Precificacao (FreteService)</w:t>
       </w:r>
     </w:p>
     <w:p>
       <w:pPr>
-        <w:pStyle w:val="Heading2"/>
+        <w:jc w:val="both"/>
       </w:pPr>
       <w:r>
-        <w:t>3.2 Entidades do Banco de Dados (Model)</w:t>
-      </w:r>
-    </w:p>
-    <w:p>
-      <w:r>
-        <w:t>Foram criadas 6 entidades JPA que representam o modelo de dados do sistema:</w:t>
-      </w:r>
-    </w:p>
-    <w:tbl>
-      <w:tblPr>
-        <w:tblStyle w:val="LightGrid-Accent1"/>
-        <w:tblW w:type="auto" w:w="0"/>
-        <w:jc w:val="center"/>
-        <w:tblLook w:firstColumn="1" w:firstRow="1" w:lastColumn="0" w:lastRow="0" w:noHBand="0" w:noVBand="1" w:val="04A0"/>
-      </w:tblPr>
-      <w:tblGrid>
-        <w:gridCol w:w="2160"/>
-        <w:gridCol w:w="2160"/>
-        <w:gridCol w:w="2160"/>
-        <w:gridCol w:w="2160"/>
-      </w:tblGrid>
-      <w:tr>
-        <w:tc>
-          <w:tcPr>
-            <w:tcW w:type="dxa" w:w="2160"/>
-          </w:tcPr>
-          <w:p>
-            <w:r/>
-            <w:r>
-              <w:rPr>
-                <w:rFonts w:ascii="Arial" w:hAnsi="Arial"/>
-                <w:b/>
-                <w:sz w:val="20"/>
-              </w:rPr>
-              <w:t>Entidade</w:t>
-            </w:r>
-          </w:p>
-        </w:tc>
-        <w:tc>
-          <w:tcPr>
-            <w:tcW w:type="dxa" w:w="2160"/>
-          </w:tcPr>
-          <w:p>
-            <w:r/>
-            <w:r>
-              <w:rPr>
-                <w:rFonts w:ascii="Arial" w:hAnsi="Arial"/>
-                <w:b/>
-                <w:sz w:val="20"/>
-              </w:rPr>
-              <w:t>Tabela</w:t>
-            </w:r>
-          </w:p>
-        </w:tc>
-        <w:tc>
-          <w:tcPr>
-            <w:tcW w:type="dxa" w:w="2160"/>
-          </w:tcPr>
-          <w:p>
-            <w:r/>
-            <w:r>
-              <w:rPr>
-                <w:rFonts w:ascii="Arial" w:hAnsi="Arial"/>
-                <w:b/>
-                <w:sz w:val="20"/>
-              </w:rPr>
-              <w:t>Descricao</w:t>
-            </w:r>
-          </w:p>
-        </w:tc>
-        <w:tc>
-          <w:tcPr>
-            <w:tcW w:type="dxa" w:w="2160"/>
-          </w:tcPr>
-          <w:p>
-            <w:r/>
-            <w:r>
-              <w:rPr>
-                <w:rFonts w:ascii="Arial" w:hAnsi="Arial"/>
-                <w:b/>
-                <w:sz w:val="20"/>
-              </w:rPr>
-              <w:t>Campos Principais</w:t>
-            </w:r>
-          </w:p>
-        </w:tc>
-      </w:tr>
-      <w:tr>
-        <w:tc>
-          <w:tcPr>
-            <w:tcW w:type="dxa" w:w="2160"/>
-          </w:tcPr>
-          <w:p>
-            <w:r/>
-            <w:r>
-              <w:rPr>
-                <w:rFonts w:ascii="Arial" w:hAnsi="Arial"/>
-                <w:sz w:val="20"/>
-              </w:rPr>
-              <w:t>Usuario</w:t>
-            </w:r>
-          </w:p>
-        </w:tc>
-        <w:tc>
-          <w:tcPr>
-            <w:tcW w:type="dxa" w:w="2160"/>
-          </w:tcPr>
-          <w:p>
-            <w:r/>
-            <w:r>
-              <w:rPr>
-                <w:rFonts w:ascii="Arial" w:hAnsi="Arial"/>
-                <w:sz w:val="20"/>
-              </w:rPr>
-              <w:t>usuarios</w:t>
-            </w:r>
-          </w:p>
-        </w:tc>
-        <w:tc>
-          <w:tcPr>
-            <w:tcW w:type="dxa" w:w="2160"/>
-          </w:tcPr>
-          <w:p>
-            <w:r/>
-            <w:r>
-              <w:rPr>
-                <w:rFonts w:ascii="Arial" w:hAnsi="Arial"/>
-                <w:sz w:val="20"/>
-              </w:rPr>
-              <w:t>Usuarios do sistema com perfis de acesso</w:t>
-            </w:r>
-          </w:p>
-        </w:tc>
-        <w:tc>
-          <w:tcPr>
-            <w:tcW w:type="dxa" w:w="2160"/>
-          </w:tcPr>
-          <w:p>
-            <w:r/>
-            <w:r>
-              <w:rPr>
-                <w:rFonts w:ascii="Arial" w:hAnsi="Arial"/>
-                <w:sz w:val="20"/>
-              </w:rPr>
-              <w:t>id, nome, email, senha, perfil, ativo</w:t>
-            </w:r>
-          </w:p>
-        </w:tc>
-      </w:tr>
-      <w:tr>
-        <w:tc>
-          <w:tcPr>
-            <w:tcW w:type="dxa" w:w="2160"/>
-          </w:tcPr>
-          <w:p>
-            <w:r/>
-            <w:r>
-              <w:rPr>
-                <w:rFonts w:ascii="Arial" w:hAnsi="Arial"/>
-                <w:sz w:val="20"/>
-              </w:rPr>
-              <w:t>Veiculo</w:t>
-            </w:r>
-          </w:p>
-        </w:tc>
-        <w:tc>
-          <w:tcPr>
-            <w:tcW w:type="dxa" w:w="2160"/>
-          </w:tcPr>
-          <w:p>
-            <w:r/>
-            <w:r>
-              <w:rPr>
-                <w:rFonts w:ascii="Arial" w:hAnsi="Arial"/>
-                <w:sz w:val="20"/>
-              </w:rPr>
-              <w:t>veiculos</w:t>
-            </w:r>
-          </w:p>
-        </w:tc>
-        <w:tc>
-          <w:tcPr>
-            <w:tcW w:type="dxa" w:w="2160"/>
-          </w:tcPr>
-          <w:p>
-            <w:r/>
-            <w:r>
-              <w:rPr>
-                <w:rFonts w:ascii="Arial" w:hAnsi="Arial"/>
-                <w:sz w:val="20"/>
-              </w:rPr>
-              <w:t>Frota de veiculos da transportadora</w:t>
-            </w:r>
-          </w:p>
-        </w:tc>
-        <w:tc>
-          <w:tcPr>
-            <w:tcW w:type="dxa" w:w="2160"/>
-          </w:tcPr>
-          <w:p>
-            <w:r/>
-            <w:r>
-              <w:rPr>
-                <w:rFonts w:ascii="Arial" w:hAnsi="Arial"/>
-                <w:sz w:val="20"/>
-              </w:rPr>
-              <w:t>id, placa, modelo, marca, ano, capacidadeKg, tipo, status</w:t>
-            </w:r>
-          </w:p>
-        </w:tc>
-      </w:tr>
-      <w:tr>
-        <w:tc>
-          <w:tcPr>
-            <w:tcW w:type="dxa" w:w="2160"/>
-          </w:tcPr>
-          <w:p>
-            <w:r/>
-            <w:r>
-              <w:rPr>
-                <w:rFonts w:ascii="Arial" w:hAnsi="Arial"/>
-                <w:sz w:val="20"/>
-              </w:rPr>
-              <w:t>Rota</w:t>
-            </w:r>
-          </w:p>
-        </w:tc>
-        <w:tc>
-          <w:tcPr>
-            <w:tcW w:type="dxa" w:w="2160"/>
-          </w:tcPr>
-          <w:p>
-            <w:r/>
-            <w:r>
-              <w:rPr>
-                <w:rFonts w:ascii="Arial" w:hAnsi="Arial"/>
-                <w:sz w:val="20"/>
-              </w:rPr>
-              <w:t>rotas</w:t>
-            </w:r>
-          </w:p>
-        </w:tc>
-        <w:tc>
-          <w:tcPr>
-            <w:tcW w:type="dxa" w:w="2160"/>
-          </w:tcPr>
-          <w:p>
-            <w:r/>
-            <w:r>
-              <w:rPr>
-                <w:rFonts w:ascii="Arial" w:hAnsi="Arial"/>
-                <w:sz w:val="20"/>
-              </w:rPr>
-              <w:t>Trajetos com origem, destino e custos</w:t>
-            </w:r>
-          </w:p>
-        </w:tc>
-        <w:tc>
-          <w:tcPr>
-            <w:tcW w:type="dxa" w:w="2160"/>
-          </w:tcPr>
-          <w:p>
-            <w:r/>
-            <w:r>
-              <w:rPr>
-                <w:rFonts w:ascii="Arial" w:hAnsi="Arial"/>
-                <w:sz w:val="20"/>
-              </w:rPr>
-              <w:t>id, origem, destino, distanciaKm, tempoEstimado, custoPedagio</w:t>
-            </w:r>
-          </w:p>
-        </w:tc>
-      </w:tr>
-      <w:tr>
-        <w:tc>
-          <w:tcPr>
-            <w:tcW w:type="dxa" w:w="2160"/>
-          </w:tcPr>
-          <w:p>
-            <w:r/>
-            <w:r>
-              <w:rPr>
-                <w:rFonts w:ascii="Arial" w:hAnsi="Arial"/>
-                <w:sz w:val="20"/>
-              </w:rPr>
-              <w:t>Carga</w:t>
-            </w:r>
-          </w:p>
-        </w:tc>
-        <w:tc>
-          <w:tcPr>
-            <w:tcW w:type="dxa" w:w="2160"/>
-          </w:tcPr>
-          <w:p>
-            <w:r/>
-            <w:r>
-              <w:rPr>
-                <w:rFonts w:ascii="Arial" w:hAnsi="Arial"/>
-                <w:sz w:val="20"/>
-              </w:rPr>
-              <w:t>cargas</w:t>
-            </w:r>
-          </w:p>
-        </w:tc>
-        <w:tc>
-          <w:tcPr>
-            <w:tcW w:type="dxa" w:w="2160"/>
-          </w:tcPr>
-          <w:p>
-            <w:r/>
-            <w:r>
-              <w:rPr>
-                <w:rFonts w:ascii="Arial" w:hAnsi="Arial"/>
-                <w:sz w:val="20"/>
-              </w:rPr>
-              <w:t>Cargas transportadas com classificacao</w:t>
-            </w:r>
-          </w:p>
-        </w:tc>
-        <w:tc>
-          <w:tcPr>
-            <w:tcW w:type="dxa" w:w="2160"/>
-          </w:tcPr>
-          <w:p>
-            <w:r/>
-            <w:r>
-              <w:rPr>
-                <w:rFonts w:ascii="Arial" w:hAnsi="Arial"/>
-                <w:sz w:val="20"/>
-              </w:rPr>
-              <w:t>id, descricao, pesoKg, volumeM3, tipo, fragil, perigosa</w:t>
-            </w:r>
-          </w:p>
-        </w:tc>
-      </w:tr>
-      <w:tr>
-        <w:tc>
-          <w:tcPr>
-            <w:tcW w:type="dxa" w:w="2160"/>
-          </w:tcPr>
-          <w:p>
-            <w:r/>
-            <w:r>
-              <w:rPr>
-                <w:rFonts w:ascii="Arial" w:hAnsi="Arial"/>
-                <w:sz w:val="20"/>
-              </w:rPr>
-              <w:t>Viagem</w:t>
-            </w:r>
-          </w:p>
-        </w:tc>
-        <w:tc>
-          <w:tcPr>
-            <w:tcW w:type="dxa" w:w="2160"/>
-          </w:tcPr>
-          <w:p>
-            <w:r/>
-            <w:r>
-              <w:rPr>
-                <w:rFonts w:ascii="Arial" w:hAnsi="Arial"/>
-                <w:sz w:val="20"/>
-              </w:rPr>
-              <w:t>viagens</w:t>
-            </w:r>
-          </w:p>
-        </w:tc>
-        <w:tc>
-          <w:tcPr>
-            <w:tcW w:type="dxa" w:w="2160"/>
-          </w:tcPr>
-          <w:p>
-            <w:r/>
-            <w:r>
-              <w:rPr>
-                <w:rFonts w:ascii="Arial" w:hAnsi="Arial"/>
-                <w:sz w:val="20"/>
-              </w:rPr>
-              <w:t>Operacoes de transporte (veiculo+rota+carga)</w:t>
-            </w:r>
-          </w:p>
-        </w:tc>
-        <w:tc>
-          <w:tcPr>
-            <w:tcW w:type="dxa" w:w="2160"/>
-          </w:tcPr>
-          <w:p>
-            <w:r/>
-            <w:r>
-              <w:rPr>
-                <w:rFonts w:ascii="Arial" w:hAnsi="Arial"/>
-                <w:sz w:val="20"/>
-              </w:rPr>
-              <w:t>id, veiculo, rota, carga, motorista, datas, status</w:t>
-            </w:r>
-          </w:p>
-        </w:tc>
-      </w:tr>
-      <w:tr>
-        <w:tc>
-          <w:tcPr>
-            <w:tcW w:type="dxa" w:w="2160"/>
-          </w:tcPr>
-          <w:p>
-            <w:r/>
-            <w:r>
-              <w:rPr>
-                <w:rFonts w:ascii="Arial" w:hAnsi="Arial"/>
-                <w:sz w:val="20"/>
-              </w:rPr>
-              <w:t>Frete</w:t>
-            </w:r>
-          </w:p>
-        </w:tc>
-        <w:tc>
-          <w:tcPr>
-            <w:tcW w:type="dxa" w:w="2160"/>
-          </w:tcPr>
-          <w:p>
-            <w:r/>
-            <w:r>
-              <w:rPr>
-                <w:rFonts w:ascii="Arial" w:hAnsi="Arial"/>
-                <w:sz w:val="20"/>
-              </w:rPr>
-              <w:t>fretes</w:t>
-            </w:r>
-          </w:p>
-        </w:tc>
-        <w:tc>
-          <w:tcPr>
-            <w:tcW w:type="dxa" w:w="2160"/>
-          </w:tcPr>
-          <w:p>
-            <w:r/>
-            <w:r>
-              <w:rPr>
-                <w:rFonts w:ascii="Arial" w:hAnsi="Arial"/>
-                <w:sz w:val="20"/>
-              </w:rPr>
-              <w:t>Calculos de precificacao de frete</w:t>
-            </w:r>
-          </w:p>
-        </w:tc>
-        <w:tc>
-          <w:tcPr>
-            <w:tcW w:type="dxa" w:w="2160"/>
-          </w:tcPr>
-          <w:p>
-            <w:r/>
-            <w:r>
-              <w:rPr>
-                <w:rFonts w:ascii="Arial" w:hAnsi="Arial"/>
-                <w:sz w:val="20"/>
-              </w:rPr>
-              <w:t>id, viagem, custos detalhados, margemLucro, valorTotal</w:t>
-            </w:r>
-          </w:p>
-        </w:tc>
-      </w:tr>
-    </w:tbl>
-    <w:p/>
-    <w:p>
-      <w:pPr>
-        <w:pStyle w:val="Heading2"/>
-      </w:pPr>
-      <w:r>
-        <w:t>3.3 Repositories</w:t>
-      </w:r>
-    </w:p>
-    <w:p>
-      <w:r>
-        <w:t>Para cada entidade foi criada uma interface que estende JpaRepository, fornecendo operacoes CRUD automaticas e consultas personalizadas (ex: buscar veiculos por status, buscar usuario por email).</w:t>
-      </w:r>
-    </w:p>
-    <w:p>
-      <w:pPr>
-        <w:pStyle w:val="Heading2"/>
-      </w:pPr>
-      <w:r>
-        <w:t>3.4 Servico de Precificacao (FreteService)</w:t>
-      </w:r>
-    </w:p>
-    <w:p>
-      <w:r>
-        <w:t>O nucleo de regras de negocio do sistema. Calcula o valor do frete com base nos seguintes parametros:</w:t>
+        <w:rPr>
+          <w:b w:val="0"/>
+        </w:rPr>
+        <w:t>O nucleo de regras de negocio do sistema, conforme especificacao do modulo de Precificacao (responsavel: Vinicius). Calcula o valor do frete com base nos seguintes parametros:</w:t>
       </w:r>
     </w:p>
     <w:p>
@@ -911,48 +630,65 @@
       </w:r>
     </w:p>
     <w:p>
+      <w:pPr>
+        <w:jc w:val="both"/>
+      </w:pPr>
       <w:r>
-        <w:t>Formula: Valor Final = (Custo Fixo + Custo Variavel) x Multiplicador Tipo x (1 + Margem/100)</w:t>
+        <w:rPr>
+          <w:b/>
+        </w:rPr>
+        <w:t>Formula:</w:t>
+      </w:r>
+    </w:p>
+    <w:p>
+      <w:r>
+        <w:rPr>
+          <w:rFonts w:ascii="Consolas" w:hAnsi="Consolas"/>
+          <w:sz w:val="18"/>
+        </w:rPr>
+        <w:t>Valor Final = (Custo Fixo + Custo Variavel) x Multiplicador Tipo x (1 + Margem/100)</w:t>
+      </w:r>
+    </w:p>
+    <w:p>
+      <w:r>
+        <w:rPr>
+          <w:b/>
+          <w:sz w:val="22"/>
+        </w:rPr>
+        <w:t>3.5 APIs REST (Controllers)</w:t>
       </w:r>
     </w:p>
     <w:p>
       <w:pPr>
-        <w:pStyle w:val="Heading2"/>
+        <w:jc w:val="both"/>
       </w:pPr>
       <w:r>
-        <w:t>3.5 APIs REST (Controllers)</w:t>
-      </w:r>
-    </w:p>
-    <w:p>
-      <w:r>
-        <w:t>Foram implementados 7 controllers com os seguintes endpoints:</w:t>
+        <w:rPr>
+          <w:b w:val="0"/>
+        </w:rPr>
+        <w:t>Foram implementados 9 controllers cobrindo todos os modulos do sistema:</w:t>
       </w:r>
     </w:p>
     <w:tbl>
       <w:tblPr>
         <w:tblStyle w:val="LightGrid-Accent1"/>
         <w:tblW w:type="auto" w:w="0"/>
-        <w:jc w:val="center"/>
         <w:tblLook w:firstColumn="1" w:firstRow="1" w:lastColumn="0" w:lastRow="0" w:noHBand="0" w:noVBand="1" w:val="04A0"/>
       </w:tblPr>
       <w:tblGrid>
-        <w:gridCol w:w="2160"/>
-        <w:gridCol w:w="2160"/>
-        <w:gridCol w:w="2160"/>
-        <w:gridCol w:w="2160"/>
+        <w:gridCol w:w="3135"/>
+        <w:gridCol w:w="3135"/>
+        <w:gridCol w:w="3135"/>
       </w:tblGrid>
       <w:tr>
         <w:tc>
           <w:tcPr>
-            <w:tcW w:type="dxa" w:w="2160"/>
+            <w:tcW w:type="dxa" w:w="3135"/>
           </w:tcPr>
           <w:p>
-            <w:r/>
             <w:r>
               <w:rPr>
-                <w:rFonts w:ascii="Arial" w:hAnsi="Arial"/>
                 <w:b/>
-                <w:sz w:val="20"/>
               </w:rPr>
               <w:t>Controller</w:t>
             </w:r>
@@ -960,49 +696,27 @@
         </w:tc>
         <w:tc>
           <w:tcPr>
-            <w:tcW w:type="dxa" w:w="2160"/>
+            <w:tcW w:type="dxa" w:w="3135"/>
           </w:tcPr>
           <w:p>
-            <w:r/>
             <w:r>
               <w:rPr>
-                <w:rFonts w:ascii="Arial" w:hAnsi="Arial"/>
                 <w:b/>
-                <w:sz w:val="20"/>
               </w:rPr>
-              <w:t>Base</w:t>
+              <w:t>Endpoint base</w:t>
             </w:r>
           </w:p>
         </w:tc>
         <w:tc>
           <w:tcPr>
-            <w:tcW w:type="dxa" w:w="2160"/>
+            <w:tcW w:type="dxa" w:w="3135"/>
           </w:tcPr>
           <w:p>
-            <w:r/>
             <w:r>
               <w:rPr>
-                <w:rFonts w:ascii="Arial" w:hAnsi="Arial"/>
                 <w:b/>
-                <w:sz w:val="20"/>
               </w:rPr>
-              <w:t>Metodos</w:t>
-            </w:r>
-          </w:p>
-        </w:tc>
-        <w:tc>
-          <w:tcPr>
-            <w:tcW w:type="dxa" w:w="2160"/>
-          </w:tcPr>
-          <w:p>
-            <w:r/>
-            <w:r>
-              <w:rPr>
-                <w:rFonts w:ascii="Arial" w:hAnsi="Arial"/>
-                <w:b/>
-                <w:sz w:val="20"/>
-              </w:rPr>
-              <w:t>Descricao</w:t>
+              <w:t>Funcionalidade</w:t>
             </w:r>
           </w:p>
         </w:tc>
@@ -1010,61 +724,31 @@
       <w:tr>
         <w:tc>
           <w:tcPr>
-            <w:tcW w:type="dxa" w:w="2160"/>
+            <w:tcW w:type="dxa" w:w="3135"/>
           </w:tcPr>
           <w:p>
-            <w:r/>
             <w:r>
-              <w:rPr>
-                <w:rFonts w:ascii="Arial" w:hAnsi="Arial"/>
-                <w:sz w:val="20"/>
-              </w:rPr>
               <w:t>AuthController</w:t>
             </w:r>
           </w:p>
         </w:tc>
         <w:tc>
           <w:tcPr>
-            <w:tcW w:type="dxa" w:w="2160"/>
+            <w:tcW w:type="dxa" w:w="3135"/>
           </w:tcPr>
           <w:p>
-            <w:r/>
             <w:r>
-              <w:rPr>
-                <w:rFonts w:ascii="Arial" w:hAnsi="Arial"/>
-                <w:sz w:val="20"/>
-              </w:rPr>
               <w:t>/api/auth</w:t>
             </w:r>
           </w:p>
         </w:tc>
         <w:tc>
           <w:tcPr>
-            <w:tcW w:type="dxa" w:w="2160"/>
+            <w:tcW w:type="dxa" w:w="3135"/>
           </w:tcPr>
           <w:p>
-            <w:r/>
             <w:r>
-              <w:rPr>
-                <w:rFonts w:ascii="Arial" w:hAnsi="Arial"/>
-                <w:sz w:val="20"/>
-              </w:rPr>
-              <w:t>POST /login, POST /registrar</w:t>
-            </w:r>
-          </w:p>
-        </w:tc>
-        <w:tc>
-          <w:tcPr>
-            <w:tcW w:type="dxa" w:w="2160"/>
-          </w:tcPr>
-          <w:p>
-            <w:r/>
-            <w:r>
-              <w:rPr>
-                <w:rFonts w:ascii="Arial" w:hAnsi="Arial"/>
-                <w:sz w:val="20"/>
-              </w:rPr>
-              <w:t>Autenticacao e registro de usuarios</w:t>
+              <w:t>Login e registro de usuarios</w:t>
             </w:r>
           </w:p>
         </w:tc>
@@ -1072,60 +756,30 @@
       <w:tr>
         <w:tc>
           <w:tcPr>
-            <w:tcW w:type="dxa" w:w="2160"/>
+            <w:tcW w:type="dxa" w:w="3135"/>
           </w:tcPr>
           <w:p>
-            <w:r/>
             <w:r>
-              <w:rPr>
-                <w:rFonts w:ascii="Arial" w:hAnsi="Arial"/>
-                <w:sz w:val="20"/>
-              </w:rPr>
               <w:t>VeiculoController</w:t>
             </w:r>
           </w:p>
         </w:tc>
         <w:tc>
           <w:tcPr>
-            <w:tcW w:type="dxa" w:w="2160"/>
+            <w:tcW w:type="dxa" w:w="3135"/>
           </w:tcPr>
           <w:p>
-            <w:r/>
             <w:r>
-              <w:rPr>
-                <w:rFonts w:ascii="Arial" w:hAnsi="Arial"/>
-                <w:sz w:val="20"/>
-              </w:rPr>
               <w:t>/api/veiculos</w:t>
             </w:r>
           </w:p>
         </w:tc>
         <w:tc>
           <w:tcPr>
-            <w:tcW w:type="dxa" w:w="2160"/>
+            <w:tcW w:type="dxa" w:w="3135"/>
           </w:tcPr>
           <w:p>
-            <w:r/>
             <w:r>
-              <w:rPr>
-                <w:rFonts w:ascii="Arial" w:hAnsi="Arial"/>
-                <w:sz w:val="20"/>
-              </w:rPr>
-              <w:t>GET, GET/{id}, POST, PUT/{id}, DELETE/{id}, GET /disponiveis</w:t>
-            </w:r>
-          </w:p>
-        </w:tc>
-        <w:tc>
-          <w:tcPr>
-            <w:tcW w:type="dxa" w:w="2160"/>
-          </w:tcPr>
-          <w:p>
-            <w:r/>
-            <w:r>
-              <w:rPr>
-                <w:rFonts w:ascii="Arial" w:hAnsi="Arial"/>
-                <w:sz w:val="20"/>
-              </w:rPr>
               <w:t>CRUD de veiculos + consulta de disponiveis</w:t>
             </w:r>
           </w:p>
@@ -1134,60 +788,30 @@
       <w:tr>
         <w:tc>
           <w:tcPr>
-            <w:tcW w:type="dxa" w:w="2160"/>
+            <w:tcW w:type="dxa" w:w="3135"/>
           </w:tcPr>
           <w:p>
-            <w:r/>
             <w:r>
-              <w:rPr>
-                <w:rFonts w:ascii="Arial" w:hAnsi="Arial"/>
-                <w:sz w:val="20"/>
-              </w:rPr>
               <w:t>RotaController</w:t>
             </w:r>
           </w:p>
         </w:tc>
         <w:tc>
           <w:tcPr>
-            <w:tcW w:type="dxa" w:w="2160"/>
+            <w:tcW w:type="dxa" w:w="3135"/>
           </w:tcPr>
           <w:p>
-            <w:r/>
             <w:r>
-              <w:rPr>
-                <w:rFonts w:ascii="Arial" w:hAnsi="Arial"/>
-                <w:sz w:val="20"/>
-              </w:rPr>
               <w:t>/api/rotas</w:t>
             </w:r>
           </w:p>
         </w:tc>
         <w:tc>
           <w:tcPr>
-            <w:tcW w:type="dxa" w:w="2160"/>
+            <w:tcW w:type="dxa" w:w="3135"/>
           </w:tcPr>
           <w:p>
-            <w:r/>
             <w:r>
-              <w:rPr>
-                <w:rFonts w:ascii="Arial" w:hAnsi="Arial"/>
-                <w:sz w:val="20"/>
-              </w:rPr>
-              <w:t>GET, GET/{id}, POST, PUT/{id}, DELETE/{id}</w:t>
-            </w:r>
-          </w:p>
-        </w:tc>
-        <w:tc>
-          <w:tcPr>
-            <w:tcW w:type="dxa" w:w="2160"/>
-          </w:tcPr>
-          <w:p>
-            <w:r/>
-            <w:r>
-              <w:rPr>
-                <w:rFonts w:ascii="Arial" w:hAnsi="Arial"/>
-                <w:sz w:val="20"/>
-              </w:rPr>
               <w:t>CRUD de rotas</w:t>
             </w:r>
           </w:p>
@@ -1196,60 +820,30 @@
       <w:tr>
         <w:tc>
           <w:tcPr>
-            <w:tcW w:type="dxa" w:w="2160"/>
+            <w:tcW w:type="dxa" w:w="3135"/>
           </w:tcPr>
           <w:p>
-            <w:r/>
             <w:r>
-              <w:rPr>
-                <w:rFonts w:ascii="Arial" w:hAnsi="Arial"/>
-                <w:sz w:val="20"/>
-              </w:rPr>
               <w:t>CargaController</w:t>
             </w:r>
           </w:p>
         </w:tc>
         <w:tc>
           <w:tcPr>
-            <w:tcW w:type="dxa" w:w="2160"/>
+            <w:tcW w:type="dxa" w:w="3135"/>
           </w:tcPr>
           <w:p>
-            <w:r/>
             <w:r>
-              <w:rPr>
-                <w:rFonts w:ascii="Arial" w:hAnsi="Arial"/>
-                <w:sz w:val="20"/>
-              </w:rPr>
               <w:t>/api/cargas</w:t>
             </w:r>
           </w:p>
         </w:tc>
         <w:tc>
           <w:tcPr>
-            <w:tcW w:type="dxa" w:w="2160"/>
+            <w:tcW w:type="dxa" w:w="3135"/>
           </w:tcPr>
           <w:p>
-            <w:r/>
             <w:r>
-              <w:rPr>
-                <w:rFonts w:ascii="Arial" w:hAnsi="Arial"/>
-                <w:sz w:val="20"/>
-              </w:rPr>
-              <w:t>GET, GET/{id}, POST, PUT/{id}, DELETE/{id}</w:t>
-            </w:r>
-          </w:p>
-        </w:tc>
-        <w:tc>
-          <w:tcPr>
-            <w:tcW w:type="dxa" w:w="2160"/>
-          </w:tcPr>
-          <w:p>
-            <w:r/>
-            <w:r>
-              <w:rPr>
-                <w:rFonts w:ascii="Arial" w:hAnsi="Arial"/>
-                <w:sz w:val="20"/>
-              </w:rPr>
               <w:t>CRUD de cargas</w:t>
             </w:r>
           </w:p>
@@ -1258,61 +852,31 @@
       <w:tr>
         <w:tc>
           <w:tcPr>
-            <w:tcW w:type="dxa" w:w="2160"/>
+            <w:tcW w:type="dxa" w:w="3135"/>
           </w:tcPr>
           <w:p>
-            <w:r/>
             <w:r>
-              <w:rPr>
-                <w:rFonts w:ascii="Arial" w:hAnsi="Arial"/>
-                <w:sz w:val="20"/>
-              </w:rPr>
-              <w:t>ViagemController</w:t>
+              <w:t>ClienteController</w:t>
             </w:r>
           </w:p>
         </w:tc>
         <w:tc>
           <w:tcPr>
-            <w:tcW w:type="dxa" w:w="2160"/>
+            <w:tcW w:type="dxa" w:w="3135"/>
           </w:tcPr>
           <w:p>
-            <w:r/>
             <w:r>
-              <w:rPr>
-                <w:rFonts w:ascii="Arial" w:hAnsi="Arial"/>
-                <w:sz w:val="20"/>
-              </w:rPr>
-              <w:t>/api/viagens</w:t>
+              <w:t>/api/clientes</w:t>
             </w:r>
           </w:p>
         </w:tc>
         <w:tc>
           <w:tcPr>
-            <w:tcW w:type="dxa" w:w="2160"/>
+            <w:tcW w:type="dxa" w:w="3135"/>
           </w:tcPr>
           <w:p>
-            <w:r/>
             <w:r>
-              <w:rPr>
-                <w:rFonts w:ascii="Arial" w:hAnsi="Arial"/>
-                <w:sz w:val="20"/>
-              </w:rPr>
-              <w:t>GET, GET/{id}, POST, PATCH/{id}/status, DELETE/{id}</w:t>
-            </w:r>
-          </w:p>
-        </w:tc>
-        <w:tc>
-          <w:tcPr>
-            <w:tcW w:type="dxa" w:w="2160"/>
-          </w:tcPr>
-          <w:p>
-            <w:r/>
-            <w:r>
-              <w:rPr>
-                <w:rFonts w:ascii="Arial" w:hAnsi="Arial"/>
-                <w:sz w:val="20"/>
-              </w:rPr>
-              <w:t>CRUD de viagens + atualizacao de status</w:t>
+              <w:t>CRUD de clientes</w:t>
             </w:r>
           </w:p>
         </w:tc>
@@ -1320,61 +884,31 @@
       <w:tr>
         <w:tc>
           <w:tcPr>
-            <w:tcW w:type="dxa" w:w="2160"/>
+            <w:tcW w:type="dxa" w:w="3135"/>
           </w:tcPr>
           <w:p>
-            <w:r/>
             <w:r>
-              <w:rPr>
-                <w:rFonts w:ascii="Arial" w:hAnsi="Arial"/>
-                <w:sz w:val="20"/>
-              </w:rPr>
-              <w:t>FreteController</w:t>
+              <w:t>MotoristaController</w:t>
             </w:r>
           </w:p>
         </w:tc>
         <w:tc>
           <w:tcPr>
-            <w:tcW w:type="dxa" w:w="2160"/>
+            <w:tcW w:type="dxa" w:w="3135"/>
           </w:tcPr>
           <w:p>
-            <w:r/>
             <w:r>
-              <w:rPr>
-                <w:rFonts w:ascii="Arial" w:hAnsi="Arial"/>
-                <w:sz w:val="20"/>
-              </w:rPr>
-              <w:t>/api/fretes</w:t>
+              <w:t>/api/motoristas</w:t>
             </w:r>
           </w:p>
         </w:tc>
         <w:tc>
           <w:tcPr>
-            <w:tcW w:type="dxa" w:w="2160"/>
+            <w:tcW w:type="dxa" w:w="3135"/>
           </w:tcPr>
           <w:p>
-            <w:r/>
             <w:r>
-              <w:rPr>
-                <w:rFonts w:ascii="Arial" w:hAnsi="Arial"/>
-                <w:sz w:val="20"/>
-              </w:rPr>
-              <w:t>POST /calcular, POST /simular, GET, DELETE/{id}</w:t>
-            </w:r>
-          </w:p>
-        </w:tc>
-        <w:tc>
-          <w:tcPr>
-            <w:tcW w:type="dxa" w:w="2160"/>
-          </w:tcPr>
-          <w:p>
-            <w:r/>
-            <w:r>
-              <w:rPr>
-                <w:rFonts w:ascii="Arial" w:hAnsi="Arial"/>
-                <w:sz w:val="20"/>
-              </w:rPr>
-              <w:t>Calculo de frete (com e sem persistencia) + historico</w:t>
+              <w:t>CRUD de motoristas</w:t>
             </w:r>
           </w:p>
         </w:tc>
@@ -1382,60 +916,94 @@
       <w:tr>
         <w:tc>
           <w:tcPr>
-            <w:tcW w:type="dxa" w:w="2160"/>
+            <w:tcW w:type="dxa" w:w="3135"/>
           </w:tcPr>
           <w:p>
-            <w:r/>
             <w:r>
-              <w:rPr>
-                <w:rFonts w:ascii="Arial" w:hAnsi="Arial"/>
-                <w:sz w:val="20"/>
-              </w:rPr>
+              <w:t>ViagemController</w:t>
+            </w:r>
+          </w:p>
+        </w:tc>
+        <w:tc>
+          <w:tcPr>
+            <w:tcW w:type="dxa" w:w="3135"/>
+          </w:tcPr>
+          <w:p>
+            <w:r>
+              <w:t>/api/viagens</w:t>
+            </w:r>
+          </w:p>
+        </w:tc>
+        <w:tc>
+          <w:tcPr>
+            <w:tcW w:type="dxa" w:w="3135"/>
+          </w:tcPr>
+          <w:p>
+            <w:r>
+              <w:t>CRUD de viagens + regras de negocio do modulo de Logistica</w:t>
+            </w:r>
+          </w:p>
+        </w:tc>
+      </w:tr>
+      <w:tr>
+        <w:tc>
+          <w:tcPr>
+            <w:tcW w:type="dxa" w:w="3135"/>
+          </w:tcPr>
+          <w:p>
+            <w:r>
+              <w:t>FreteController</w:t>
+            </w:r>
+          </w:p>
+        </w:tc>
+        <w:tc>
+          <w:tcPr>
+            <w:tcW w:type="dxa" w:w="3135"/>
+          </w:tcPr>
+          <w:p>
+            <w:r>
+              <w:t>/api/fretes</w:t>
+            </w:r>
+          </w:p>
+        </w:tc>
+        <w:tc>
+          <w:tcPr>
+            <w:tcW w:type="dxa" w:w="3135"/>
+          </w:tcPr>
+          <w:p>
+            <w:r>
+              <w:t>Calculo de frete + historico</w:t>
+            </w:r>
+          </w:p>
+        </w:tc>
+      </w:tr>
+      <w:tr>
+        <w:tc>
+          <w:tcPr>
+            <w:tcW w:type="dxa" w:w="3135"/>
+          </w:tcPr>
+          <w:p>
+            <w:r>
               <w:t>RelatorioController</w:t>
             </w:r>
           </w:p>
         </w:tc>
         <w:tc>
           <w:tcPr>
-            <w:tcW w:type="dxa" w:w="2160"/>
+            <w:tcW w:type="dxa" w:w="3135"/>
           </w:tcPr>
           <w:p>
-            <w:r/>
             <w:r>
-              <w:rPr>
-                <w:rFonts w:ascii="Arial" w:hAnsi="Arial"/>
-                <w:sz w:val="20"/>
-              </w:rPr>
-              <w:t>/api/relatorios</w:t>
+              <w:t>/api/relatorios/dashboard</w:t>
             </w:r>
           </w:p>
         </w:tc>
         <w:tc>
           <w:tcPr>
-            <w:tcW w:type="dxa" w:w="2160"/>
+            <w:tcW w:type="dxa" w:w="3135"/>
           </w:tcPr>
           <w:p>
-            <w:r/>
             <w:r>
-              <w:rPr>
-                <w:rFonts w:ascii="Arial" w:hAnsi="Arial"/>
-                <w:sz w:val="20"/>
-              </w:rPr>
-              <w:t>GET /dashboard</w:t>
-            </w:r>
-          </w:p>
-        </w:tc>
-        <w:tc>
-          <w:tcPr>
-            <w:tcW w:type="dxa" w:w="2160"/>
-          </w:tcPr>
-          <w:p>
-            <w:r/>
-            <w:r>
-              <w:rPr>
-                <w:rFonts w:ascii="Arial" w:hAnsi="Arial"/>
-                <w:sz w:val="20"/>
-              </w:rPr>
               <w:t>Indicadores gerais do sistema</w:t>
             </w:r>
           </w:p>
@@ -1444,10 +1012,11 @@
     </w:tbl>
     <w:p/>
     <w:p>
-      <w:pPr>
-        <w:pStyle w:val="Heading2"/>
-      </w:pPr>
       <w:r>
+        <w:rPr>
+          <w:b/>
+          <w:sz w:val="22"/>
+        </w:rPr>
         <w:t>3.6 Configuracoes</w:t>
       </w:r>
     </w:p>
@@ -1464,41 +1033,660 @@
         <w:pStyle w:val="ListBullet"/>
       </w:pPr>
       <w:r>
-        <w:t>DataInitializer: carga inicial automatica com 2 usuarios, 3 veiculos, 3 rotas e 2 cargas de exemplo para facilitar demonstracoes.</w:t>
+        <w:t>DataInitializer: carga inicial automatica com 2 usuarios, 3 veiculos, 3 rotas, 2 cargas, 3 clientes e 3 motoristas para facilitar demonstracoes.</w:t>
+      </w:r>
+    </w:p>
+    <w:p>
+      <w:r>
+        <w:rPr>
+          <w:b/>
+          <w:color w:val="2C3E50"/>
+          <w:sz w:val="26"/>
+        </w:rPr>
+        <w:t>4. Integracao das Entregas dos Demais Integrantes</w:t>
       </w:r>
     </w:p>
     <w:p>
       <w:pPr>
-        <w:pStyle w:val="Heading1"/>
+        <w:jc w:val="both"/>
       </w:pPr>
       <w:r>
-        <w:t>4. Tecnologias Utilizadas</w:t>
+        <w:rPr>
+          <w:b w:val="0"/>
+        </w:rPr>
+        <w:t>Esta secao documenta como cada entrega individual foi incorporada ao sistema consolidado, garantindo a fidelidade ao trabalho de cada integrante e a rastreabilidade entre os relatorios e o codigo-fonte.</w:t>
+      </w:r>
+    </w:p>
+    <w:p>
+      <w:r>
+        <w:rPr>
+          <w:b/>
+          <w:sz w:val="22"/>
+        </w:rPr>
+        <w:t>4.1 Modelagem de Banco de Dados - Gabriela Andrade Brito (RA 20240868)</w:t>
+      </w:r>
+    </w:p>
+    <w:p>
+      <w:pPr>
+        <w:jc w:val="both"/>
+      </w:pPr>
+      <w:r>
+        <w:rPr>
+          <w:b w:val="0"/>
+        </w:rPr>
+        <w:t>A modelagem inicial entregue pela Gabriela (5 tabelas: clientes, motoristas, veiculos, viagens, fretes) foi a base para a evolucao do banco consolidado. O script transportadora_completo.sql mantem credito explicito a autoria original em seu cabecalho:</w:t>
+      </w:r>
+    </w:p>
+    <w:p>
+      <w:r>
+        <w:rPr>
+          <w:rFonts w:ascii="Consolas" w:hAnsi="Consolas"/>
+          <w:sz w:val="18"/>
+        </w:rPr>
+        <w:t>-- Modelagem original: Gabriela Andrade Brito (RA 20240868)</w:t>
+        <w:br/>
+        <w:t>-- Refinamento e integracao: Pedro H. A. Marcandali (RA 20241595)</w:t>
+      </w:r>
+    </w:p>
+    <w:p>
+      <w:pPr>
+        <w:jc w:val="both"/>
+      </w:pPr>
+      <w:r>
+        <w:rPr>
+          <w:b w:val="0"/>
+        </w:rPr>
+        <w:t>Evolucao da modelagem:</w:t>
       </w:r>
     </w:p>
     <w:tbl>
       <w:tblPr>
         <w:tblStyle w:val="LightGrid-Accent1"/>
         <w:tblW w:type="auto" w:w="0"/>
-        <w:jc w:val="center"/>
         <w:tblLook w:firstColumn="1" w:firstRow="1" w:lastColumn="0" w:lastRow="0" w:noHBand="0" w:noVBand="1" w:val="04A0"/>
       </w:tblPr>
       <w:tblGrid>
-        <w:gridCol w:w="2880"/>
-        <w:gridCol w:w="2880"/>
-        <w:gridCol w:w="2880"/>
+        <w:gridCol w:w="3135"/>
+        <w:gridCol w:w="3135"/>
+        <w:gridCol w:w="3135"/>
       </w:tblGrid>
       <w:tr>
         <w:tc>
           <w:tcPr>
-            <w:tcW w:type="dxa" w:w="2880"/>
+            <w:tcW w:type="dxa" w:w="3135"/>
           </w:tcPr>
           <w:p>
-            <w:r/>
             <w:r>
               <w:rPr>
-                <w:rFonts w:ascii="Arial" w:hAnsi="Arial"/>
                 <w:b/>
-                <w:sz w:val="20"/>
+              </w:rPr>
+              <w:t>Aspecto</w:t>
+            </w:r>
+          </w:p>
+        </w:tc>
+        <w:tc>
+          <w:tcPr>
+            <w:tcW w:type="dxa" w:w="3135"/>
+          </w:tcPr>
+          <w:p>
+            <w:r>
+              <w:rPr>
+                <w:b/>
+              </w:rPr>
+              <w:t>Versao Etapa 1 (Gabriela)</w:t>
+            </w:r>
+          </w:p>
+        </w:tc>
+        <w:tc>
+          <w:tcPr>
+            <w:tcW w:type="dxa" w:w="3135"/>
+          </w:tcPr>
+          <w:p>
+            <w:r>
+              <w:rPr>
+                <w:b/>
+              </w:rPr>
+              <w:t>Versao consolidada</w:t>
+            </w:r>
+          </w:p>
+        </w:tc>
+      </w:tr>
+      <w:tr>
+        <w:tc>
+          <w:tcPr>
+            <w:tcW w:type="dxa" w:w="3135"/>
+          </w:tcPr>
+          <w:p>
+            <w:r>
+              <w:t>Numero de tabelas</w:t>
+            </w:r>
+          </w:p>
+        </w:tc>
+        <w:tc>
+          <w:tcPr>
+            <w:tcW w:type="dxa" w:w="3135"/>
+          </w:tcPr>
+          <w:p>
+            <w:r>
+              <w:t>5</w:t>
+            </w:r>
+          </w:p>
+        </w:tc>
+        <w:tc>
+          <w:tcPr>
+            <w:tcW w:type="dxa" w:w="3135"/>
+          </w:tcPr>
+          <w:p>
+            <w:r>
+              <w:t>8</w:t>
+            </w:r>
+          </w:p>
+        </w:tc>
+      </w:tr>
+      <w:tr>
+        <w:tc>
+          <w:tcPr>
+            <w:tcW w:type="dxa" w:w="3135"/>
+          </w:tcPr>
+          <w:p>
+            <w:r>
+              <w:t>Normalizacao</w:t>
+            </w:r>
+          </w:p>
+        </w:tc>
+        <w:tc>
+          <w:tcPr>
+            <w:tcW w:type="dxa" w:w="3135"/>
+          </w:tcPr>
+          <w:p>
+            <w:r>
+              <w:t>Origem/destino inline na tabela viagens</w:t>
+            </w:r>
+          </w:p>
+        </w:tc>
+        <w:tc>
+          <w:tcPr>
+            <w:tcW w:type="dxa" w:w="3135"/>
+          </w:tcPr>
+          <w:p>
+            <w:r>
+              <w:t>Tabela rotas separada com FK</w:t>
+            </w:r>
+          </w:p>
+        </w:tc>
+      </w:tr>
+      <w:tr>
+        <w:tc>
+          <w:tcPr>
+            <w:tcW w:type="dxa" w:w="3135"/>
+          </w:tcPr>
+          <w:p>
+            <w:r>
+              <w:t>Cargas</w:t>
+            </w:r>
+          </w:p>
+        </w:tc>
+        <w:tc>
+          <w:tcPr>
+            <w:tcW w:type="dxa" w:w="3135"/>
+          </w:tcPr>
+          <w:p>
+            <w:r>
+              <w:t>Atributo na viagem</w:t>
+            </w:r>
+          </w:p>
+        </w:tc>
+        <w:tc>
+          <w:tcPr>
+            <w:tcW w:type="dxa" w:w="3135"/>
+          </w:tcPr>
+          <w:p>
+            <w:r>
+              <w:t>Tabela cargas separada</w:t>
+            </w:r>
+          </w:p>
+        </w:tc>
+      </w:tr>
+      <w:tr>
+        <w:tc>
+          <w:tcPr>
+            <w:tcW w:type="dxa" w:w="3135"/>
+          </w:tcPr>
+          <w:p>
+            <w:r>
+              <w:t>Usuarios</w:t>
+            </w:r>
+          </w:p>
+        </w:tc>
+        <w:tc>
+          <w:tcPr>
+            <w:tcW w:type="dxa" w:w="3135"/>
+          </w:tcPr>
+          <w:p>
+            <w:r>
+              <w:t>Nao havia</w:t>
+            </w:r>
+          </w:p>
+        </w:tc>
+        <w:tc>
+          <w:tcPr>
+            <w:tcW w:type="dxa" w:w="3135"/>
+          </w:tcPr>
+          <w:p>
+            <w:r>
+              <w:t>Tabela usuarios com perfis</w:t>
+            </w:r>
+          </w:p>
+        </w:tc>
+      </w:tr>
+      <w:tr>
+        <w:tc>
+          <w:tcPr>
+            <w:tcW w:type="dxa" w:w="3135"/>
+          </w:tcPr>
+          <w:p>
+            <w:r>
+              <w:t>Custos no frete</w:t>
+            </w:r>
+          </w:p>
+        </w:tc>
+        <w:tc>
+          <w:tcPr>
+            <w:tcW w:type="dxa" w:w="3135"/>
+          </w:tcPr>
+          <w:p>
+            <w:r>
+              <w:t>peso_kg + valor</w:t>
+            </w:r>
+          </w:p>
+        </w:tc>
+        <w:tc>
+          <w:tcPr>
+            <w:tcW w:type="dxa" w:w="3135"/>
+          </w:tcPr>
+          <w:p>
+            <w:r>
+              <w:t>Custos discriminados (combustivel, manutencao, pedagio, fixo)</w:t>
+            </w:r>
+          </w:p>
+        </w:tc>
+      </w:tr>
+    </w:tbl>
+    <w:p/>
+    <w:p>
+      <w:pPr>
+        <w:jc w:val="both"/>
+      </w:pPr>
+      <w:r>
+        <w:rPr>
+          <w:b w:val="0"/>
+        </w:rPr>
+        <w:t>O arquivo original da Gabriela esta preservado no repositorio como transportadora.sql, servindo como artefato historico da Etapa 1.</w:t>
+      </w:r>
+    </w:p>
+    <w:p>
+      <w:r>
+        <w:rPr>
+          <w:b/>
+          <w:sz w:val="22"/>
+        </w:rPr>
+        <w:t>4.2 Modulo de Logistica e Operacoes - Leonardo Dos Santos (RA 20221957)</w:t>
+      </w:r>
+    </w:p>
+    <w:p>
+      <w:pPr>
+        <w:jc w:val="both"/>
+      </w:pPr>
+      <w:r>
+        <w:rPr>
+          <w:b w:val="0"/>
+        </w:rPr>
+        <w:t>O relatorio do Leonardo descreve as classes principais do modulo de Logistica (Veiculo, Carga, Rota, Viagem) e tres regras de negocio criticas. As classes ja estavam implementadas; as regras de negocio foram adicionadas ao ViagemController em 28/04/2026 para garantir fidelidade total ao modulo descrito por ele:</w:t>
+      </w:r>
+    </w:p>
+    <w:tbl>
+      <w:tblPr>
+        <w:tblStyle w:val="LightGrid-Accent1"/>
+        <w:tblW w:type="auto" w:w="0"/>
+        <w:tblLook w:firstColumn="1" w:firstRow="1" w:lastColumn="0" w:lastRow="0" w:noHBand="0" w:noVBand="1" w:val="04A0"/>
+      </w:tblPr>
+      <w:tblGrid>
+        <w:gridCol w:w="4703"/>
+        <w:gridCol w:w="4703"/>
+      </w:tblGrid>
+      <w:tr>
+        <w:tc>
+          <w:tcPr>
+            <w:tcW w:type="dxa" w:w="4703"/>
+          </w:tcPr>
+          <w:p>
+            <w:r>
+              <w:rPr>
+                <w:b/>
+              </w:rPr>
+              <w:t>Regra de negocio (relatorio do Leonardo)</w:t>
+            </w:r>
+          </w:p>
+        </w:tc>
+        <w:tc>
+          <w:tcPr>
+            <w:tcW w:type="dxa" w:w="4703"/>
+          </w:tcPr>
+          <w:p>
+            <w:r>
+              <w:rPr>
+                <w:b/>
+              </w:rPr>
+              <w:t>Implementacao</w:t>
+            </w:r>
+          </w:p>
+        </w:tc>
+      </w:tr>
+      <w:tr>
+        <w:tc>
+          <w:tcPr>
+            <w:tcW w:type="dxa" w:w="4703"/>
+          </w:tcPr>
+          <w:p>
+            <w:r>
+              <w:t>Um veiculo so pode iniciar uma viagem se estiver disponivel</w:t>
+            </w:r>
+          </w:p>
+        </w:tc>
+        <w:tc>
+          <w:tcPr>
+            <w:tcW w:type="dxa" w:w="4703"/>
+          </w:tcPr>
+          <w:p>
+            <w:r>
+              <w:t>ViagemController.criar() valida veiculo.getStatus() == DISPONIVEL</w:t>
+            </w:r>
+          </w:p>
+        </w:tc>
+      </w:tr>
+      <w:tr>
+        <w:tc>
+          <w:tcPr>
+            <w:tcW w:type="dxa" w:w="4703"/>
+          </w:tcPr>
+          <w:p>
+            <w:r>
+              <w:t>A soma do peso das cargas nao pode ultrapassar a capacidade do veiculo</w:t>
+            </w:r>
+          </w:p>
+        </w:tc>
+        <w:tc>
+          <w:tcPr>
+            <w:tcW w:type="dxa" w:w="4703"/>
+          </w:tcPr>
+          <w:p>
+            <w:r>
+              <w:t>ViagemController.criar() valida carga.getPesoKg() &lt;= veiculo.getCapacidadeKg()</w:t>
+            </w:r>
+          </w:p>
+        </w:tc>
+      </w:tr>
+      <w:tr>
+        <w:tc>
+          <w:tcPr>
+            <w:tcW w:type="dxa" w:w="4703"/>
+          </w:tcPr>
+          <w:p>
+            <w:r>
+              <w:t>Toda viagem deve estar associada a uma rota valida</w:t>
+            </w:r>
+          </w:p>
+        </w:tc>
+        <w:tc>
+          <w:tcPr>
+            <w:tcW w:type="dxa" w:w="4703"/>
+          </w:tcPr>
+          <w:p>
+            <w:r>
+              <w:t>ViagemController.criar() exige rotaId valido (busca por ID)</w:t>
+            </w:r>
+          </w:p>
+        </w:tc>
+      </w:tr>
+    </w:tbl>
+    <w:p/>
+    <w:p>
+      <w:pPr>
+        <w:jc w:val="both"/>
+      </w:pPr>
+      <w:r>
+        <w:rPr>
+          <w:b w:val="0"/>
+        </w:rPr>
+        <w:t>Cada validacao no codigo possui comentario citando a origem:</w:t>
+      </w:r>
+    </w:p>
+    <w:p>
+      <w:r>
+        <w:rPr>
+          <w:rFonts w:ascii="Consolas" w:hAnsi="Consolas"/>
+          <w:sz w:val="18"/>
+        </w:rPr>
+        <w:t>// Regra de negocio (modulo de Logistica - Leonardo):</w:t>
+        <w:br/>
+        <w:t>// Um veiculo so pode iniciar uma viagem se estiver disponivel</w:t>
+        <w:br/>
+        <w:t>if (veiculo.getStatus() != Veiculo.StatusVeiculo.DISPONIVEL) { ... }</w:t>
+      </w:r>
+    </w:p>
+    <w:p>
+      <w:r>
+        <w:rPr>
+          <w:b/>
+          <w:sz w:val="22"/>
+        </w:rPr>
+        <w:t>4.3 Frontend e Documentacao - Diego Henrique C. Custodio (RA 20240153)</w:t>
+      </w:r>
+    </w:p>
+    <w:p>
+      <w:pPr>
+        <w:jc w:val="both"/>
+      </w:pPr>
+      <w:r>
+        <w:rPr>
+          <w:b w:val="0"/>
+        </w:rPr>
+        <w:t>O relatorio do Diego documenta a arquitetura visual do sistema e os arquivos originais (Estrutura HTML.docx) entregaram a paleta de cores, o estilo de botoes e o card de resultado da precificacao. Esses elementos foram integrados ao SPA consolidado:</w:t>
+      </w:r>
+    </w:p>
+    <w:tbl>
+      <w:tblPr>
+        <w:tblStyle w:val="LightGrid-Accent1"/>
+        <w:tblW w:type="auto" w:w="0"/>
+        <w:tblLook w:firstColumn="1" w:firstRow="1" w:lastColumn="0" w:lastRow="0" w:noHBand="0" w:noVBand="1" w:val="04A0"/>
+      </w:tblPr>
+      <w:tblGrid>
+        <w:gridCol w:w="4703"/>
+        <w:gridCol w:w="4703"/>
+      </w:tblGrid>
+      <w:tr>
+        <w:tc>
+          <w:tcPr>
+            <w:tcW w:type="dxa" w:w="4703"/>
+          </w:tcPr>
+          <w:p>
+            <w:r>
+              <w:rPr>
+                <w:b/>
+              </w:rPr>
+              <w:t>Elemento (Diego)</w:t>
+            </w:r>
+          </w:p>
+        </w:tc>
+        <w:tc>
+          <w:tcPr>
+            <w:tcW w:type="dxa" w:w="4703"/>
+          </w:tcPr>
+          <w:p>
+            <w:r>
+              <w:rPr>
+                <w:b/>
+              </w:rPr>
+              <w:t>Onde foi aplicado no SPA</w:t>
+            </w:r>
+          </w:p>
+        </w:tc>
+      </w:tr>
+      <w:tr>
+        <w:tc>
+          <w:tcPr>
+            <w:tcW w:type="dxa" w:w="4703"/>
+          </w:tcPr>
+          <w:p>
+            <w:r>
+              <w:t>Paleta navy #2c3e50 / verde #27ae60 / fundo #f4f7f6 / azul #3498db</w:t>
+            </w:r>
+          </w:p>
+        </w:tc>
+        <w:tc>
+          <w:tcPr>
+            <w:tcW w:type="dxa" w:w="4703"/>
+          </w:tcPr>
+          <w:p>
+            <w:r>
+              <w:t>Variaveis :root do css/style.css</w:t>
+            </w:r>
+          </w:p>
+        </w:tc>
+      </w:tr>
+      <w:tr>
+        <w:tc>
+          <w:tcPr>
+            <w:tcW w:type="dxa" w:w="4703"/>
+          </w:tcPr>
+          <w:p>
+            <w:r>
+              <w:t>Botao de acao verde com hover #219150</w:t>
+            </w:r>
+          </w:p>
+        </w:tc>
+        <w:tc>
+          <w:tcPr>
+            <w:tcW w:type="dxa" w:w="4703"/>
+          </w:tcPr>
+          <w:p>
+            <w:r>
+              <w:t>Classe .btn-success</w:t>
+            </w:r>
+          </w:p>
+        </w:tc>
+      </w:tr>
+      <w:tr>
+        <w:tc>
+          <w:tcPr>
+            <w:tcW w:type="dxa" w:w="4703"/>
+          </w:tcPr>
+          <w:p>
+            <w:r>
+              <w:t>Card de resultado com fundo azul claro e borda lateral</w:t>
+            </w:r>
+          </w:p>
+        </w:tc>
+        <w:tc>
+          <w:tcPr>
+            <w:tcW w:type="dxa" w:w="4703"/>
+          </w:tcPr>
+          <w:p>
+            <w:r>
+              <w:t>Classe .calc-result (tela de Calculo de Frete)</w:t>
+            </w:r>
+          </w:p>
+        </w:tc>
+      </w:tr>
+      <w:tr>
+        <w:tc>
+          <w:tcPr>
+            <w:tcW w:type="dxa" w:w="4703"/>
+          </w:tcPr>
+          <w:p>
+            <w:r>
+              <w:t>Estrutura de telas (cadastro de veiculo, precificacao)</w:t>
+            </w:r>
+          </w:p>
+        </w:tc>
+        <w:tc>
+          <w:tcPr>
+            <w:tcW w:type="dxa" w:w="4703"/>
+          </w:tcPr>
+          <w:p>
+            <w:r>
+              <w:t>Abas correspondentes da SPA unica</w:t>
+            </w:r>
+          </w:p>
+        </w:tc>
+      </w:tr>
+    </w:tbl>
+    <w:p/>
+    <w:p>
+      <w:pPr>
+        <w:jc w:val="both"/>
+      </w:pPr>
+      <w:r>
+        <w:rPr>
+          <w:b w:val="0"/>
+        </w:rPr>
+        <w:t>O cabecalho do css/style.css cita explicitamente a autoria da identidade visual:</w:t>
+      </w:r>
+    </w:p>
+    <w:p>
+      <w:r>
+        <w:rPr>
+          <w:rFonts w:ascii="Consolas" w:hAnsi="Consolas"/>
+          <w:sz w:val="18"/>
+        </w:rPr>
+        <w:t>/* Identidade visual e paleta de cores definidas por</w:t>
+        <w:br/>
+        <w:t xml:space="preserve">   Diego Henrique C. Custodio (RA 20240153) - modulo Frontend</w:t>
+        <w:br/>
+        <w:t xml:space="preserve">   no documento "Estrutura HTML.docx" (Etapa 1).        */</w:t>
+      </w:r>
+    </w:p>
+    <w:p>
+      <w:pPr>
+        <w:jc w:val="both"/>
+      </w:pPr>
+      <w:r>
+        <w:rPr>
+          <w:b w:val="0"/>
+        </w:rPr>
+        <w:t>Os arquivos originais (index.html, style.css, script.js, precificacao.html, precificacao.js) estao preservados em docs/frontend-etapa1-diego/ como artefato historico, com README explicando a evolucao Etapa 1 -&gt; SPA consolidada.</w:t>
+      </w:r>
+    </w:p>
+    <w:p>
+      <w:r>
+        <w:rPr>
+          <w:b/>
+          <w:color w:val="2C3E50"/>
+          <w:sz w:val="26"/>
+        </w:rPr>
+        <w:t>5. Tecnologias Utilizadas</w:t>
+      </w:r>
+    </w:p>
+    <w:tbl>
+      <w:tblPr>
+        <w:tblStyle w:val="LightGrid-Accent1"/>
+        <w:tblW w:type="auto" w:w="0"/>
+        <w:tblLook w:firstColumn="1" w:firstRow="1" w:lastColumn="0" w:lastRow="0" w:noHBand="0" w:noVBand="1" w:val="04A0"/>
+      </w:tblPr>
+      <w:tblGrid>
+        <w:gridCol w:w="3135"/>
+        <w:gridCol w:w="3135"/>
+        <w:gridCol w:w="3135"/>
+      </w:tblGrid>
+      <w:tr>
+        <w:tc>
+          <w:tcPr>
+            <w:tcW w:type="dxa" w:w="3135"/>
+          </w:tcPr>
+          <w:p>
+            <w:r>
+              <w:rPr>
+                <w:b/>
               </w:rPr>
               <w:t>Tecnologia</w:t>
             </w:r>
@@ -1506,15 +1694,12 @@
         </w:tc>
         <w:tc>
           <w:tcPr>
-            <w:tcW w:type="dxa" w:w="2880"/>
+            <w:tcW w:type="dxa" w:w="3135"/>
           </w:tcPr>
           <w:p>
-            <w:r/>
             <w:r>
               <w:rPr>
-                <w:rFonts w:ascii="Arial" w:hAnsi="Arial"/>
                 <w:b/>
-                <w:sz w:val="20"/>
               </w:rPr>
               <w:t>Versao</w:t>
             </w:r>
@@ -1522,15 +1707,12 @@
         </w:tc>
         <w:tc>
           <w:tcPr>
-            <w:tcW w:type="dxa" w:w="2880"/>
+            <w:tcW w:type="dxa" w:w="3135"/>
           </w:tcPr>
           <w:p>
-            <w:r/>
             <w:r>
               <w:rPr>
-                <w:rFonts w:ascii="Arial" w:hAnsi="Arial"/>
                 <w:b/>
-                <w:sz w:val="20"/>
               </w:rPr>
               <w:t>Finalidade</w:t>
             </w:r>
@@ -1540,45 +1722,30 @@
       <w:tr>
         <w:tc>
           <w:tcPr>
-            <w:tcW w:type="dxa" w:w="2880"/>
+            <w:tcW w:type="dxa" w:w="3135"/>
           </w:tcPr>
           <w:p>
-            <w:r/>
             <w:r>
-              <w:rPr>
-                <w:rFonts w:ascii="Arial" w:hAnsi="Arial"/>
-                <w:sz w:val="20"/>
-              </w:rPr>
               <w:t>Java</w:t>
             </w:r>
           </w:p>
         </w:tc>
         <w:tc>
           <w:tcPr>
-            <w:tcW w:type="dxa" w:w="2880"/>
+            <w:tcW w:type="dxa" w:w="3135"/>
           </w:tcPr>
           <w:p>
-            <w:r/>
             <w:r>
-              <w:rPr>
-                <w:rFonts w:ascii="Arial" w:hAnsi="Arial"/>
-                <w:sz w:val="20"/>
-              </w:rPr>
               <w:t>21 (Temurin)</w:t>
             </w:r>
           </w:p>
         </w:tc>
         <w:tc>
           <w:tcPr>
-            <w:tcW w:type="dxa" w:w="2880"/>
+            <w:tcW w:type="dxa" w:w="3135"/>
           </w:tcPr>
           <w:p>
-            <w:r/>
             <w:r>
-              <w:rPr>
-                <w:rFonts w:ascii="Arial" w:hAnsi="Arial"/>
-                <w:sz w:val="20"/>
-              </w:rPr>
               <w:t>Linguagem principal do backend</w:t>
             </w:r>
           </w:p>
@@ -1587,45 +1754,30 @@
       <w:tr>
         <w:tc>
           <w:tcPr>
-            <w:tcW w:type="dxa" w:w="2880"/>
+            <w:tcW w:type="dxa" w:w="3135"/>
           </w:tcPr>
           <w:p>
-            <w:r/>
             <w:r>
-              <w:rPr>
-                <w:rFonts w:ascii="Arial" w:hAnsi="Arial"/>
-                <w:sz w:val="20"/>
-              </w:rPr>
               <w:t>Spring Boot</w:t>
             </w:r>
           </w:p>
         </w:tc>
         <w:tc>
           <w:tcPr>
-            <w:tcW w:type="dxa" w:w="2880"/>
+            <w:tcW w:type="dxa" w:w="3135"/>
           </w:tcPr>
           <w:p>
-            <w:r/>
             <w:r>
-              <w:rPr>
-                <w:rFonts w:ascii="Arial" w:hAnsi="Arial"/>
-                <w:sz w:val="20"/>
-              </w:rPr>
               <w:t>3.5.0</w:t>
             </w:r>
           </w:p>
         </w:tc>
         <w:tc>
           <w:tcPr>
-            <w:tcW w:type="dxa" w:w="2880"/>
+            <w:tcW w:type="dxa" w:w="3135"/>
           </w:tcPr>
           <w:p>
-            <w:r/>
             <w:r>
-              <w:rPr>
-                <w:rFonts w:ascii="Arial" w:hAnsi="Arial"/>
-                <w:sz w:val="20"/>
-              </w:rPr>
               <w:t>Framework web e injecao de dependencias</w:t>
             </w:r>
           </w:p>
@@ -1634,45 +1786,30 @@
       <w:tr>
         <w:tc>
           <w:tcPr>
-            <w:tcW w:type="dxa" w:w="2880"/>
+            <w:tcW w:type="dxa" w:w="3135"/>
           </w:tcPr>
           <w:p>
-            <w:r/>
             <w:r>
-              <w:rPr>
-                <w:rFonts w:ascii="Arial" w:hAnsi="Arial"/>
-                <w:sz w:val="20"/>
-              </w:rPr>
               <w:t>Spring Data JPA</w:t>
             </w:r>
           </w:p>
         </w:tc>
         <w:tc>
           <w:tcPr>
-            <w:tcW w:type="dxa" w:w="2880"/>
+            <w:tcW w:type="dxa" w:w="3135"/>
           </w:tcPr>
           <w:p>
-            <w:r/>
             <w:r>
-              <w:rPr>
-                <w:rFonts w:ascii="Arial" w:hAnsi="Arial"/>
-                <w:sz w:val="20"/>
-              </w:rPr>
               <w:t>3.5.0</w:t>
             </w:r>
           </w:p>
         </w:tc>
         <w:tc>
           <w:tcPr>
-            <w:tcW w:type="dxa" w:w="2880"/>
+            <w:tcW w:type="dxa" w:w="3135"/>
           </w:tcPr>
           <w:p>
-            <w:r/>
             <w:r>
-              <w:rPr>
-                <w:rFonts w:ascii="Arial" w:hAnsi="Arial"/>
-                <w:sz w:val="20"/>
-              </w:rPr>
               <w:t>Acesso a dados com Hibernate</w:t>
             </w:r>
           </w:p>
@@ -1681,46 +1818,31 @@
       <w:tr>
         <w:tc>
           <w:tcPr>
-            <w:tcW w:type="dxa" w:w="2880"/>
+            <w:tcW w:type="dxa" w:w="3135"/>
           </w:tcPr>
           <w:p>
-            <w:r/>
             <w:r>
-              <w:rPr>
-                <w:rFonts w:ascii="Arial" w:hAnsi="Arial"/>
-                <w:sz w:val="20"/>
-              </w:rPr>
               <w:t>Spring Security</w:t>
             </w:r>
           </w:p>
         </w:tc>
         <w:tc>
           <w:tcPr>
-            <w:tcW w:type="dxa" w:w="2880"/>
+            <w:tcW w:type="dxa" w:w="3135"/>
           </w:tcPr>
           <w:p>
-            <w:r/>
             <w:r>
-              <w:rPr>
-                <w:rFonts w:ascii="Arial" w:hAnsi="Arial"/>
-                <w:sz w:val="20"/>
-              </w:rPr>
               <w:t>6.x</w:t>
             </w:r>
           </w:p>
         </w:tc>
         <w:tc>
           <w:tcPr>
-            <w:tcW w:type="dxa" w:w="2880"/>
+            <w:tcW w:type="dxa" w:w="3135"/>
           </w:tcPr>
           <w:p>
-            <w:r/>
             <w:r>
-              <w:rPr>
-                <w:rFonts w:ascii="Arial" w:hAnsi="Arial"/>
-                <w:sz w:val="20"/>
-              </w:rPr>
-              <w:t>Autenticacao e autorizacao</w:t>
+              <w:t>Autenticacao e autorizacao com BCrypt</w:t>
             </w:r>
           </w:p>
         </w:tc>
@@ -1728,46 +1850,31 @@
       <w:tr>
         <w:tc>
           <w:tcPr>
-            <w:tcW w:type="dxa" w:w="2880"/>
+            <w:tcW w:type="dxa" w:w="3135"/>
           </w:tcPr>
           <w:p>
-            <w:r/>
             <w:r>
-              <w:rPr>
-                <w:rFonts w:ascii="Arial" w:hAnsi="Arial"/>
-                <w:sz w:val="20"/>
-              </w:rPr>
               <w:t>H2 Database</w:t>
             </w:r>
           </w:p>
         </w:tc>
         <w:tc>
           <w:tcPr>
-            <w:tcW w:type="dxa" w:w="2880"/>
+            <w:tcW w:type="dxa" w:w="3135"/>
           </w:tcPr>
           <w:p>
-            <w:r/>
             <w:r>
-              <w:rPr>
-                <w:rFonts w:ascii="Arial" w:hAnsi="Arial"/>
-                <w:sz w:val="20"/>
-              </w:rPr>
               <w:t>2.3.x</w:t>
             </w:r>
           </w:p>
         </w:tc>
         <w:tc>
           <w:tcPr>
-            <w:tcW w:type="dxa" w:w="2880"/>
+            <w:tcW w:type="dxa" w:w="3135"/>
           </w:tcPr>
           <w:p>
-            <w:r/>
             <w:r>
-              <w:rPr>
-                <w:rFonts w:ascii="Arial" w:hAnsi="Arial"/>
-                <w:sz w:val="20"/>
-              </w:rPr>
-              <w:t>Banco de dados relacional (arquivo local)</w:t>
+              <w:t>Banco de dados (desenvolvimento)</w:t>
             </w:r>
           </w:p>
         </w:tc>
@@ -1775,46 +1882,530 @@
       <w:tr>
         <w:tc>
           <w:tcPr>
-            <w:tcW w:type="dxa" w:w="2880"/>
+            <w:tcW w:type="dxa" w:w="3135"/>
           </w:tcPr>
           <w:p>
-            <w:r/>
             <w:r>
-              <w:rPr>
-                <w:rFonts w:ascii="Arial" w:hAnsi="Arial"/>
-                <w:sz w:val="20"/>
-              </w:rPr>
+              <w:t>MySQL</w:t>
+            </w:r>
+          </w:p>
+        </w:tc>
+        <w:tc>
+          <w:tcPr>
+            <w:tcW w:type="dxa" w:w="3135"/>
+          </w:tcPr>
+          <w:p>
+            <w:r>
+              <w:t>8.x</w:t>
+            </w:r>
+          </w:p>
+        </w:tc>
+        <w:tc>
+          <w:tcPr>
+            <w:tcW w:type="dxa" w:w="3135"/>
+          </w:tcPr>
+          <w:p>
+            <w:r>
+              <w:t>Banco de dados (producao)</w:t>
+            </w:r>
+          </w:p>
+        </w:tc>
+      </w:tr>
+      <w:tr>
+        <w:tc>
+          <w:tcPr>
+            <w:tcW w:type="dxa" w:w="3135"/>
+          </w:tcPr>
+          <w:p>
+            <w:r>
               <w:t>Maven</w:t>
             </w:r>
           </w:p>
         </w:tc>
         <w:tc>
           <w:tcPr>
-            <w:tcW w:type="dxa" w:w="2880"/>
+            <w:tcW w:type="dxa" w:w="3135"/>
           </w:tcPr>
           <w:p>
-            <w:r/>
             <w:r>
-              <w:rPr>
-                <w:rFonts w:ascii="Arial" w:hAnsi="Arial"/>
-                <w:sz w:val="20"/>
-              </w:rPr>
               <w:t>3.9.x (wrapper)</w:t>
             </w:r>
           </w:p>
         </w:tc>
         <w:tc>
           <w:tcPr>
-            <w:tcW w:type="dxa" w:w="2880"/>
+            <w:tcW w:type="dxa" w:w="3135"/>
           </w:tcPr>
           <w:p>
-            <w:r/>
+            <w:r>
+              <w:t>Gerenciamento de dependencias e build</w:t>
+            </w:r>
+          </w:p>
+        </w:tc>
+      </w:tr>
+      <w:tr>
+        <w:tc>
+          <w:tcPr>
+            <w:tcW w:type="dxa" w:w="3135"/>
+          </w:tcPr>
+          <w:p>
+            <w:r>
+              <w:t>HTML5 / CSS3 / JavaScript</w:t>
+            </w:r>
+          </w:p>
+        </w:tc>
+        <w:tc>
+          <w:tcPr>
+            <w:tcW w:type="dxa" w:w="3135"/>
+          </w:tcPr>
+          <w:p>
+            <w:r>
+              <w:t>-</w:t>
+            </w:r>
+          </w:p>
+        </w:tc>
+        <w:tc>
+          <w:tcPr>
+            <w:tcW w:type="dxa" w:w="3135"/>
+          </w:tcPr>
+          <w:p>
+            <w:r>
+              <w:t>Frontend SPA</w:t>
+            </w:r>
+          </w:p>
+        </w:tc>
+      </w:tr>
+      <w:tr>
+        <w:tc>
+          <w:tcPr>
+            <w:tcW w:type="dxa" w:w="3135"/>
+          </w:tcPr>
+          <w:p>
+            <w:r>
+              <w:t>Lucide Icons</w:t>
+            </w:r>
+          </w:p>
+        </w:tc>
+        <w:tc>
+          <w:tcPr>
+            <w:tcW w:type="dxa" w:w="3135"/>
+          </w:tcPr>
+          <w:p>
+            <w:r>
+              <w:t>-</w:t>
+            </w:r>
+          </w:p>
+        </w:tc>
+        <w:tc>
+          <w:tcPr>
+            <w:tcW w:type="dxa" w:w="3135"/>
+          </w:tcPr>
+          <w:p>
+            <w:r>
+              <w:t>Iconografia SVG</w:t>
+            </w:r>
+          </w:p>
+        </w:tc>
+      </w:tr>
+    </w:tbl>
+    <w:p/>
+    <w:p>
+      <w:r>
+        <w:rPr>
+          <w:b/>
+          <w:color w:val="2C3E50"/>
+          <w:sz w:val="26"/>
+        </w:rPr>
+        <w:t>6. Estrutura do Projeto</w:t>
+      </w:r>
+    </w:p>
+    <w:p>
+      <w:r>
+        <w:rPr>
+          <w:rFonts w:ascii="Consolas" w:hAnsi="Consolas"/>
+          <w:sz w:val="18"/>
+        </w:rPr>
+        <w:t>projeto-faculdade/</w:t>
+        <w:br/>
+        <w:t xml:space="preserve">  logistica-completo-reserva/    # backend + frontend (modulo principal)</w:t>
+        <w:br/>
+        <w:t xml:space="preserve">    src/main/java/com/transportadora/logistica/</w:t>
+        <w:br/>
+        <w:t xml:space="preserve">      model/         -- 8 entidades JPA</w:t>
+        <w:br/>
+        <w:t xml:space="preserve">      repository/    -- 8 interfaces JpaRepository</w:t>
+        <w:br/>
+        <w:t xml:space="preserve">      service/       -- FreteService (precificacao - Vinicius)</w:t>
+        <w:br/>
+        <w:t xml:space="preserve">      controller/    -- 9 REST controllers</w:t>
+        <w:br/>
+        <w:t xml:space="preserve">      config/        -- SecurityConfig + DataInitializer</w:t>
+        <w:br/>
+        <w:t xml:space="preserve">    src/main/resources/</w:t>
+        <w:br/>
+        <w:t xml:space="preserve">      static/        -- SPA (paleta visual: Diego)</w:t>
+        <w:br/>
+        <w:t xml:space="preserve">      application.properties</w:t>
+        <w:br/>
+        <w:t xml:space="preserve">  logistica-backend/             # somente APIs REST</w:t>
+        <w:br/>
+        <w:t xml:space="preserve">  transportadora_completo.sql    # script MySQL consolidado (Gabriela + Pedro)</w:t>
+        <w:br/>
+        <w:t xml:space="preserve">  transportadora.sql             # script Etapa 1 (Gabriela - historico)</w:t>
+        <w:br/>
+        <w:t xml:space="preserve">  docs/</w:t>
+        <w:br/>
+        <w:t xml:space="preserve">    frontend-etapa1-diego/       # arquivos originais do Diego (Etapa 1)</w:t>
+        <w:br/>
+        <w:t xml:space="preserve">  README.md</w:t>
+      </w:r>
+    </w:p>
+    <w:p>
+      <w:r>
+        <w:rPr>
+          <w:b/>
+          <w:color w:val="2C3E50"/>
+          <w:sz w:val="26"/>
+        </w:rPr>
+        <w:t>7. Status das Entregas do Grupo</w:t>
+      </w:r>
+    </w:p>
+    <w:tbl>
+      <w:tblPr>
+        <w:tblStyle w:val="LightGrid-Accent1"/>
+        <w:tblW w:type="auto" w:w="0"/>
+        <w:tblLook w:firstColumn="1" w:firstRow="1" w:lastColumn="0" w:lastRow="0" w:noHBand="0" w:noVBand="1" w:val="04A0"/>
+      </w:tblPr>
+      <w:tblGrid>
+        <w:gridCol w:w="1881"/>
+        <w:gridCol w:w="1881"/>
+        <w:gridCol w:w="1881"/>
+        <w:gridCol w:w="1881"/>
+        <w:gridCol w:w="1881"/>
+      </w:tblGrid>
+      <w:tr>
+        <w:tc>
+          <w:tcPr>
+            <w:tcW w:type="dxa" w:w="1881"/>
+          </w:tcPr>
+          <w:p>
             <w:r>
               <w:rPr>
-                <w:rFonts w:ascii="Arial" w:hAnsi="Arial"/>
-                <w:sz w:val="20"/>
+                <w:b/>
               </w:rPr>
-              <w:t>Gerenciamento de dependencias e build</w:t>
+              <w:t>Integrante</w:t>
+            </w:r>
+          </w:p>
+        </w:tc>
+        <w:tc>
+          <w:tcPr>
+            <w:tcW w:type="dxa" w:w="1881"/>
+          </w:tcPr>
+          <w:p>
+            <w:r>
+              <w:rPr>
+                <w:b/>
+              </w:rPr>
+              <w:t>Area</w:t>
+            </w:r>
+          </w:p>
+        </w:tc>
+        <w:tc>
+          <w:tcPr>
+            <w:tcW w:type="dxa" w:w="1881"/>
+          </w:tcPr>
+          <w:p>
+            <w:r>
+              <w:rPr>
+                <w:b/>
+              </w:rPr>
+              <w:t>Relatorio</w:t>
+            </w:r>
+          </w:p>
+        </w:tc>
+        <w:tc>
+          <w:tcPr>
+            <w:tcW w:type="dxa" w:w="1881"/>
+          </w:tcPr>
+          <w:p>
+            <w:r>
+              <w:rPr>
+                <w:b/>
+              </w:rPr>
+              <w:t>Codigo</w:t>
+            </w:r>
+          </w:p>
+        </w:tc>
+        <w:tc>
+          <w:tcPr>
+            <w:tcW w:type="dxa" w:w="1881"/>
+          </w:tcPr>
+          <w:p>
+            <w:r>
+              <w:rPr>
+                <w:b/>
+              </w:rPr>
+              <w:t>Integracao</w:t>
+            </w:r>
+          </w:p>
+        </w:tc>
+      </w:tr>
+      <w:tr>
+        <w:tc>
+          <w:tcPr>
+            <w:tcW w:type="dxa" w:w="1881"/>
+          </w:tcPr>
+          <w:p>
+            <w:r>
+              <w:t>Gabriela Andrade Brito</w:t>
+            </w:r>
+          </w:p>
+        </w:tc>
+        <w:tc>
+          <w:tcPr>
+            <w:tcW w:type="dxa" w:w="1881"/>
+          </w:tcPr>
+          <w:p>
+            <w:r>
+              <w:t>Banco de Dados</w:t>
+            </w:r>
+          </w:p>
+        </w:tc>
+        <w:tc>
+          <w:tcPr>
+            <w:tcW w:type="dxa" w:w="1881"/>
+          </w:tcPr>
+          <w:p>
+            <w:r>
+              <w:t>Entregue</w:t>
+            </w:r>
+          </w:p>
+        </w:tc>
+        <w:tc>
+          <w:tcPr>
+            <w:tcW w:type="dxa" w:w="1881"/>
+          </w:tcPr>
+          <w:p>
+            <w:r>
+              <w:t>Entregue</w:t>
+            </w:r>
+          </w:p>
+        </w:tc>
+        <w:tc>
+          <w:tcPr>
+            <w:tcW w:type="dxa" w:w="1881"/>
+          </w:tcPr>
+          <w:p>
+            <w:r>
+              <w:t>Concluida</w:t>
+            </w:r>
+          </w:p>
+        </w:tc>
+      </w:tr>
+      <w:tr>
+        <w:tc>
+          <w:tcPr>
+            <w:tcW w:type="dxa" w:w="1881"/>
+          </w:tcPr>
+          <w:p>
+            <w:r>
+              <w:t>Leonardo Dos Santos</w:t>
+            </w:r>
+          </w:p>
+        </w:tc>
+        <w:tc>
+          <w:tcPr>
+            <w:tcW w:type="dxa" w:w="1881"/>
+          </w:tcPr>
+          <w:p>
+            <w:r>
+              <w:t>Logistica e Operacoes</w:t>
+            </w:r>
+          </w:p>
+        </w:tc>
+        <w:tc>
+          <w:tcPr>
+            <w:tcW w:type="dxa" w:w="1881"/>
+          </w:tcPr>
+          <w:p>
+            <w:r>
+              <w:t>Entregue</w:t>
+            </w:r>
+          </w:p>
+        </w:tc>
+        <w:tc>
+          <w:tcPr>
+            <w:tcW w:type="dxa" w:w="1881"/>
+          </w:tcPr>
+          <w:p>
+            <w:r>
+              <w:t>Entregue</w:t>
+            </w:r>
+          </w:p>
+        </w:tc>
+        <w:tc>
+          <w:tcPr>
+            <w:tcW w:type="dxa" w:w="1881"/>
+          </w:tcPr>
+          <w:p>
+            <w:r>
+              <w:t>Concluida</w:t>
+            </w:r>
+          </w:p>
+        </w:tc>
+      </w:tr>
+      <w:tr>
+        <w:tc>
+          <w:tcPr>
+            <w:tcW w:type="dxa" w:w="1881"/>
+          </w:tcPr>
+          <w:p>
+            <w:r>
+              <w:t>Diego Henrique C. Custodio</w:t>
+            </w:r>
+          </w:p>
+        </w:tc>
+        <w:tc>
+          <w:tcPr>
+            <w:tcW w:type="dxa" w:w="1881"/>
+          </w:tcPr>
+          <w:p>
+            <w:r>
+              <w:t>Frontend e Documentacao</w:t>
+            </w:r>
+          </w:p>
+        </w:tc>
+        <w:tc>
+          <w:tcPr>
+            <w:tcW w:type="dxa" w:w="1881"/>
+          </w:tcPr>
+          <w:p>
+            <w:r>
+              <w:t>Entregue</w:t>
+            </w:r>
+          </w:p>
+        </w:tc>
+        <w:tc>
+          <w:tcPr>
+            <w:tcW w:type="dxa" w:w="1881"/>
+          </w:tcPr>
+          <w:p>
+            <w:r>
+              <w:t>Entregue</w:t>
+            </w:r>
+          </w:p>
+        </w:tc>
+        <w:tc>
+          <w:tcPr>
+            <w:tcW w:type="dxa" w:w="1881"/>
+          </w:tcPr>
+          <w:p>
+            <w:r>
+              <w:t>Concluida</w:t>
+            </w:r>
+          </w:p>
+        </w:tc>
+      </w:tr>
+      <w:tr>
+        <w:tc>
+          <w:tcPr>
+            <w:tcW w:type="dxa" w:w="1881"/>
+          </w:tcPr>
+          <w:p>
+            <w:r>
+              <w:t>Pedro H. A. Marcandali</w:t>
+            </w:r>
+          </w:p>
+        </w:tc>
+        <w:tc>
+          <w:tcPr>
+            <w:tcW w:type="dxa" w:w="1881"/>
+          </w:tcPr>
+          <w:p>
+            <w:r>
+              <w:t>Backend e Estrutura</w:t>
+            </w:r>
+          </w:p>
+        </w:tc>
+        <w:tc>
+          <w:tcPr>
+            <w:tcW w:type="dxa" w:w="1881"/>
+          </w:tcPr>
+          <w:p>
+            <w:r>
+              <w:t>Entregue</w:t>
+            </w:r>
+          </w:p>
+        </w:tc>
+        <w:tc>
+          <w:tcPr>
+            <w:tcW w:type="dxa" w:w="1881"/>
+          </w:tcPr>
+          <w:p>
+            <w:r>
+              <w:t>Entregue</w:t>
+            </w:r>
+          </w:p>
+        </w:tc>
+        <w:tc>
+          <w:tcPr>
+            <w:tcW w:type="dxa" w:w="1881"/>
+          </w:tcPr>
+          <w:p>
+            <w:r>
+              <w:t>-</w:t>
+            </w:r>
+          </w:p>
+        </w:tc>
+      </w:tr>
+      <w:tr>
+        <w:tc>
+          <w:tcPr>
+            <w:tcW w:type="dxa" w:w="1881"/>
+          </w:tcPr>
+          <w:p>
+            <w:r>
+              <w:t>Vinicius Eduardo da Silva</w:t>
+            </w:r>
+          </w:p>
+        </w:tc>
+        <w:tc>
+          <w:tcPr>
+            <w:tcW w:type="dxa" w:w="1881"/>
+          </w:tcPr>
+          <w:p>
+            <w:r>
+              <w:t>Precificacao</w:t>
+            </w:r>
+          </w:p>
+        </w:tc>
+        <w:tc>
+          <w:tcPr>
+            <w:tcW w:type="dxa" w:w="1881"/>
+          </w:tcPr>
+          <w:p>
+            <w:r>
+              <w:t>Pendente</w:t>
+            </w:r>
+          </w:p>
+        </w:tc>
+        <w:tc>
+          <w:tcPr>
+            <w:tcW w:type="dxa" w:w="1881"/>
+          </w:tcPr>
+          <w:p>
+            <w:r>
+              <w:t>Implementado</w:t>
+            </w:r>
+          </w:p>
+        </w:tc>
+        <w:tc>
+          <w:tcPr>
+            <w:tcW w:type="dxa" w:w="1881"/>
+          </w:tcPr>
+          <w:p>
+            <w:r>
+              <w:t>Aguarda relatorio</w:t>
             </w:r>
           </w:p>
         </w:tc>
@@ -1823,68 +2414,46 @@
     <w:p/>
     <w:p>
       <w:pPr>
-        <w:pStyle w:val="Heading1"/>
+        <w:jc w:val="both"/>
       </w:pPr>
       <w:r>
-        <w:t>5. Estrutura do Projeto</w:t>
+        <w:rPr>
+          <w:b w:val="0"/>
+        </w:rPr>
+        <w:t>Observacao: o codigo de precificacao (FreteService.java) ja esta implementado e operacional, refletindo a logica do modulo do Vinicius. Falta apenas a entrega do relatorio parcial documentando a especificacao por parte dele.</w:t>
       </w:r>
     </w:p>
     <w:p>
       <w:r>
-        <w:t>logistica-backend/</w:t>
-        <w:br/>
-        <w:t xml:space="preserve">  src/main/java/com/transportadora/logistica/</w:t>
-        <w:br/>
-        <w:t xml:space="preserve">    model/          -- 6 entidades JPA</w:t>
-        <w:br/>
-        <w:t xml:space="preserve">    repository/     -- 6 interfaces JpaRepository</w:t>
-        <w:br/>
-        <w:t xml:space="preserve">    service/        -- FreteService (precificacao)</w:t>
-        <w:br/>
-        <w:t xml:space="preserve">    controller/     -- 7 REST controllers</w:t>
-        <w:br/>
-        <w:t xml:space="preserve">    config/         -- SecurityConfig + DataInitializer</w:t>
-        <w:br/>
-        <w:t xml:space="preserve">  src/main/resources/</w:t>
-        <w:br/>
-        <w:t xml:space="preserve">    application.properties  -- Configuracao do banco e servidor</w:t>
-        <w:br/>
-        <w:t xml:space="preserve">  pom.xml                   -- Dependencias Maven</w:t>
-      </w:r>
-    </w:p>
-    <w:p>
-      <w:pPr>
-        <w:pStyle w:val="Heading1"/>
-      </w:pPr>
-      <w:r>
-        <w:t>6. Pendencias (da minha parte)</w:t>
+        <w:rPr>
+          <w:b/>
+          <w:color w:val="2C3E50"/>
+          <w:sz w:val="26"/>
+        </w:rPr>
+        <w:t>8. Pendencias</w:t>
       </w:r>
     </w:p>
     <w:tbl>
       <w:tblPr>
         <w:tblStyle w:val="LightGrid-Accent1"/>
         <w:tblW w:type="auto" w:w="0"/>
-        <w:jc w:val="center"/>
         <w:tblLook w:firstColumn="1" w:firstRow="1" w:lastColumn="0" w:lastRow="0" w:noHBand="0" w:noVBand="1" w:val="04A0"/>
       </w:tblPr>
       <w:tblGrid>
-        <w:gridCol w:w="2160"/>
-        <w:gridCol w:w="2160"/>
-        <w:gridCol w:w="2160"/>
-        <w:gridCol w:w="2160"/>
+        <w:gridCol w:w="2351"/>
+        <w:gridCol w:w="2351"/>
+        <w:gridCol w:w="2351"/>
+        <w:gridCol w:w="2351"/>
       </w:tblGrid>
       <w:tr>
         <w:tc>
           <w:tcPr>
-            <w:tcW w:type="dxa" w:w="2160"/>
+            <w:tcW w:type="dxa" w:w="2351"/>
           </w:tcPr>
           <w:p>
-            <w:r/>
             <w:r>
               <w:rPr>
-                <w:rFonts w:ascii="Arial" w:hAnsi="Arial"/>
                 <w:b/>
-                <w:sz w:val="20"/>
               </w:rPr>
               <w:t>Item</w:t>
             </w:r>
@@ -1892,15 +2461,12 @@
         </w:tc>
         <w:tc>
           <w:tcPr>
-            <w:tcW w:type="dxa" w:w="2160"/>
+            <w:tcW w:type="dxa" w:w="2351"/>
           </w:tcPr>
           <w:p>
-            <w:r/>
             <w:r>
               <w:rPr>
-                <w:rFonts w:ascii="Arial" w:hAnsi="Arial"/>
                 <w:b/>
-                <w:sz w:val="20"/>
               </w:rPr>
               <w:t>Prioridade</w:t>
             </w:r>
@@ -1908,15 +2474,12 @@
         </w:tc>
         <w:tc>
           <w:tcPr>
-            <w:tcW w:type="dxa" w:w="2160"/>
+            <w:tcW w:type="dxa" w:w="2351"/>
           </w:tcPr>
           <w:p>
-            <w:r/>
             <w:r>
               <w:rPr>
-                <w:rFonts w:ascii="Arial" w:hAnsi="Arial"/>
                 <w:b/>
-                <w:sz w:val="20"/>
               </w:rPr>
               <w:t>Status</w:t>
             </w:r>
@@ -1924,15 +2487,12 @@
         </w:tc>
         <w:tc>
           <w:tcPr>
-            <w:tcW w:type="dxa" w:w="2160"/>
+            <w:tcW w:type="dxa" w:w="2351"/>
           </w:tcPr>
           <w:p>
-            <w:r/>
             <w:r>
               <w:rPr>
-                <w:rFonts w:ascii="Arial" w:hAnsi="Arial"/>
                 <w:b/>
-                <w:sz w:val="20"/>
               </w:rPr>
               <w:t>Observacao</w:t>
             </w:r>
@@ -1942,61 +2502,41 @@
       <w:tr>
         <w:tc>
           <w:tcPr>
-            <w:tcW w:type="dxa" w:w="2160"/>
+            <w:tcW w:type="dxa" w:w="2351"/>
           </w:tcPr>
           <w:p>
-            <w:r/>
             <w:r>
-              <w:rPr>
-                <w:rFonts w:ascii="Arial" w:hAnsi="Arial"/>
-                <w:sz w:val="20"/>
-              </w:rPr>
               <w:t>Diagramas UML (com Diego)</w:t>
             </w:r>
           </w:p>
         </w:tc>
         <w:tc>
           <w:tcPr>
-            <w:tcW w:type="dxa" w:w="2160"/>
+            <w:tcW w:type="dxa" w:w="2351"/>
           </w:tcPr>
           <w:p>
-            <w:r/>
             <w:r>
-              <w:rPr>
-                <w:rFonts w:ascii="Arial" w:hAnsi="Arial"/>
-                <w:sz w:val="20"/>
-              </w:rPr>
               <w:t>Alta</w:t>
             </w:r>
           </w:p>
         </w:tc>
         <w:tc>
           <w:tcPr>
-            <w:tcW w:type="dxa" w:w="2160"/>
+            <w:tcW w:type="dxa" w:w="2351"/>
           </w:tcPr>
           <w:p>
-            <w:r/>
             <w:r>
-              <w:rPr>
-                <w:rFonts w:ascii="Arial" w:hAnsi="Arial"/>
-                <w:sz w:val="20"/>
-              </w:rPr>
               <w:t>Pendente</w:t>
             </w:r>
           </w:p>
         </w:tc>
         <w:tc>
           <w:tcPr>
-            <w:tcW w:type="dxa" w:w="2160"/>
+            <w:tcW w:type="dxa" w:w="2351"/>
           </w:tcPr>
           <w:p>
-            <w:r/>
             <w:r>
-              <w:rPr>
-                <w:rFonts w:ascii="Arial" w:hAnsi="Arial"/>
-                <w:sz w:val="20"/>
-              </w:rPr>
-              <w:t>Diagrama de Classes, Casos de Uso e Sequencia. Estrutura do sistema ja esta pronta para gerar os diagramas.</w:t>
+              <w:t>Diagrama de Classes, Casos de Uso e Sequencia</w:t>
             </w:r>
           </w:p>
         </w:tc>
@@ -2004,61 +2544,41 @@
       <w:tr>
         <w:tc>
           <w:tcPr>
-            <w:tcW w:type="dxa" w:w="2160"/>
+            <w:tcW w:type="dxa" w:w="2351"/>
           </w:tcPr>
           <w:p>
-            <w:r/>
             <w:r>
-              <w:rPr>
-                <w:rFonts w:ascii="Arial" w:hAnsi="Arial"/>
-                <w:sz w:val="20"/>
-              </w:rPr>
-              <w:t>Modelos do banco - DER (com Gabriela)</w:t>
+              <w:t>DER formal (com Gabriela)</w:t>
             </w:r>
           </w:p>
         </w:tc>
         <w:tc>
           <w:tcPr>
-            <w:tcW w:type="dxa" w:w="2160"/>
+            <w:tcW w:type="dxa" w:w="2351"/>
           </w:tcPr>
           <w:p>
-            <w:r/>
             <w:r>
-              <w:rPr>
-                <w:rFonts w:ascii="Arial" w:hAnsi="Arial"/>
-                <w:sz w:val="20"/>
-              </w:rPr>
               <w:t>Alta</w:t>
             </w:r>
           </w:p>
         </w:tc>
         <w:tc>
           <w:tcPr>
-            <w:tcW w:type="dxa" w:w="2160"/>
+            <w:tcW w:type="dxa" w:w="2351"/>
           </w:tcPr>
           <w:p>
-            <w:r/>
             <w:r>
-              <w:rPr>
-                <w:rFonts w:ascii="Arial" w:hAnsi="Arial"/>
-                <w:sz w:val="20"/>
-              </w:rPr>
               <w:t>Pendente</w:t>
             </w:r>
           </w:p>
         </w:tc>
         <w:tc>
           <w:tcPr>
-            <w:tcW w:type="dxa" w:w="2160"/>
+            <w:tcW w:type="dxa" w:w="2351"/>
           </w:tcPr>
           <w:p>
-            <w:r/>
             <w:r>
-              <w:rPr>
-                <w:rFonts w:ascii="Arial" w:hAnsi="Arial"/>
-                <w:sz w:val="20"/>
-              </w:rPr>
-              <w:t>As entidades JPA ja definem o modelo. Falta gerar o DER formal e o script SQL para documentacao.</w:t>
+              <w:t>Modelo JPA pronto - falta gerar DER visual</w:t>
             </w:r>
           </w:p>
         </w:tc>
@@ -2066,61 +2586,41 @@
       <w:tr>
         <w:tc>
           <w:tcPr>
-            <w:tcW w:type="dxa" w:w="2160"/>
+            <w:tcW w:type="dxa" w:w="2351"/>
           </w:tcPr>
           <w:p>
-            <w:r/>
             <w:r>
-              <w:rPr>
-                <w:rFonts w:ascii="Arial" w:hAnsi="Arial"/>
-                <w:sz w:val="20"/>
-              </w:rPr>
-              <w:t>Testes unitarios</w:t>
+              <w:t>Relatorio Vinicius (precificacao)</w:t>
             </w:r>
           </w:p>
         </w:tc>
         <w:tc>
           <w:tcPr>
-            <w:tcW w:type="dxa" w:w="2160"/>
+            <w:tcW w:type="dxa" w:w="2351"/>
           </w:tcPr>
           <w:p>
-            <w:r/>
             <w:r>
-              <w:rPr>
-                <w:rFonts w:ascii="Arial" w:hAnsi="Arial"/>
-                <w:sz w:val="20"/>
-              </w:rPr>
-              <w:t>Media</w:t>
+              <w:t>Alta</w:t>
             </w:r>
           </w:p>
         </w:tc>
         <w:tc>
           <w:tcPr>
-            <w:tcW w:type="dxa" w:w="2160"/>
+            <w:tcW w:type="dxa" w:w="2351"/>
           </w:tcPr>
           <w:p>
-            <w:r/>
             <w:r>
-              <w:rPr>
-                <w:rFonts w:ascii="Arial" w:hAnsi="Arial"/>
-                <w:sz w:val="20"/>
-              </w:rPr>
               <w:t>Pendente</w:t>
             </w:r>
           </w:p>
         </w:tc>
         <w:tc>
           <w:tcPr>
-            <w:tcW w:type="dxa" w:w="2160"/>
+            <w:tcW w:type="dxa" w:w="2351"/>
           </w:tcPr>
           <w:p>
-            <w:r/>
             <w:r>
-              <w:rPr>
-                <w:rFonts w:ascii="Arial" w:hAnsi="Arial"/>
-                <w:sz w:val="20"/>
-              </w:rPr>
-              <w:t>Testes automatizados do FreteService e dos controllers.</w:t>
+              <w:t>Cobranca para entrega</w:t>
             </w:r>
           </w:p>
         </w:tc>
@@ -2128,61 +2628,41 @@
       <w:tr>
         <w:tc>
           <w:tcPr>
-            <w:tcW w:type="dxa" w:w="2160"/>
+            <w:tcW w:type="dxa" w:w="2351"/>
           </w:tcPr>
           <w:p>
-            <w:r/>
             <w:r>
-              <w:rPr>
-                <w:rFonts w:ascii="Arial" w:hAnsi="Arial"/>
-                <w:sz w:val="20"/>
-              </w:rPr>
-              <w:t>Documentacao da API</w:t>
+              <w:t>Testes unitarios</w:t>
             </w:r>
           </w:p>
         </w:tc>
         <w:tc>
           <w:tcPr>
-            <w:tcW w:type="dxa" w:w="2160"/>
+            <w:tcW w:type="dxa" w:w="2351"/>
           </w:tcPr>
           <w:p>
-            <w:r/>
             <w:r>
-              <w:rPr>
-                <w:rFonts w:ascii="Arial" w:hAnsi="Arial"/>
-                <w:sz w:val="20"/>
-              </w:rPr>
-              <w:t>Baixa</w:t>
+              <w:t>Media</w:t>
             </w:r>
           </w:p>
         </w:tc>
         <w:tc>
           <w:tcPr>
-            <w:tcW w:type="dxa" w:w="2160"/>
+            <w:tcW w:type="dxa" w:w="2351"/>
           </w:tcPr>
           <w:p>
-            <w:r/>
             <w:r>
-              <w:rPr>
-                <w:rFonts w:ascii="Arial" w:hAnsi="Arial"/>
-                <w:sz w:val="20"/>
-              </w:rPr>
               <w:t>Pendente</w:t>
             </w:r>
           </w:p>
         </w:tc>
         <w:tc>
           <w:tcPr>
-            <w:tcW w:type="dxa" w:w="2160"/>
+            <w:tcW w:type="dxa" w:w="2351"/>
           </w:tcPr>
           <w:p>
-            <w:r/>
             <w:r>
-              <w:rPr>
-                <w:rFonts w:ascii="Arial" w:hAnsi="Arial"/>
-                <w:sz w:val="20"/>
-              </w:rPr>
-              <w:t>Documentacao formal dos endpoints REST (pode ser gerada com Swagger).</w:t>
+              <w:t>Testes automatizados do FreteService e dos controllers</w:t>
             </w:r>
           </w:p>
         </w:tc>
@@ -2190,61 +2670,83 @@
       <w:tr>
         <w:tc>
           <w:tcPr>
-            <w:tcW w:type="dxa" w:w="2160"/>
+            <w:tcW w:type="dxa" w:w="2351"/>
           </w:tcPr>
           <w:p>
-            <w:r/>
             <w:r>
-              <w:rPr>
-                <w:rFonts w:ascii="Arial" w:hAnsi="Arial"/>
-                <w:sz w:val="20"/>
-              </w:rPr>
-              <w:t>Preparacao da apresentacao</w:t>
+              <w:t>Documentacao da API (Swagger)</w:t>
             </w:r>
           </w:p>
         </w:tc>
         <w:tc>
           <w:tcPr>
-            <w:tcW w:type="dxa" w:w="2160"/>
+            <w:tcW w:type="dxa" w:w="2351"/>
           </w:tcPr>
           <w:p>
-            <w:r/>
             <w:r>
-              <w:rPr>
-                <w:rFonts w:ascii="Arial" w:hAnsi="Arial"/>
-                <w:sz w:val="20"/>
-              </w:rPr>
+              <w:t>Baixa</w:t>
+            </w:r>
+          </w:p>
+        </w:tc>
+        <w:tc>
+          <w:tcPr>
+            <w:tcW w:type="dxa" w:w="2351"/>
+          </w:tcPr>
+          <w:p>
+            <w:r>
+              <w:t>Pendente</w:t>
+            </w:r>
+          </w:p>
+        </w:tc>
+        <w:tc>
+          <w:tcPr>
+            <w:tcW w:type="dxa" w:w="2351"/>
+          </w:tcPr>
+          <w:p>
+            <w:r>
+              <w:t>Pode ser gerada com springdoc-openapi</w:t>
+            </w:r>
+          </w:p>
+        </w:tc>
+      </w:tr>
+      <w:tr>
+        <w:tc>
+          <w:tcPr>
+            <w:tcW w:type="dxa" w:w="2351"/>
+          </w:tcPr>
+          <w:p>
+            <w:r>
+              <w:t>Slides de apresentacao final</w:t>
+            </w:r>
+          </w:p>
+        </w:tc>
+        <w:tc>
+          <w:tcPr>
+            <w:tcW w:type="dxa" w:w="2351"/>
+          </w:tcPr>
+          <w:p>
+            <w:r>
               <w:t>Alta</w:t>
             </w:r>
           </w:p>
         </w:tc>
         <w:tc>
           <w:tcPr>
-            <w:tcW w:type="dxa" w:w="2160"/>
+            <w:tcW w:type="dxa" w:w="2351"/>
           </w:tcPr>
           <w:p>
-            <w:r/>
             <w:r>
-              <w:rPr>
-                <w:rFonts w:ascii="Arial" w:hAnsi="Arial"/>
-                <w:sz w:val="20"/>
-              </w:rPr>
               <w:t>Pendente</w:t>
             </w:r>
           </w:p>
         </w:tc>
         <w:tc>
           <w:tcPr>
-            <w:tcW w:type="dxa" w:w="2160"/>
+            <w:tcW w:type="dxa" w:w="2351"/>
           </w:tcPr>
           <w:p>
-            <w:r/>
             <w:r>
-              <w:rPr>
-                <w:rFonts w:ascii="Arial" w:hAnsi="Arial"/>
-                <w:sz w:val="20"/>
-              </w:rPr>
-              <w:t>Montar slides para a apresentacao de 19/05/2026.</w:t>
+              <w:t>Apresentacao em 19/05/2026</w:t>
             </w:r>
           </w:p>
         </w:tc>
@@ -2252,39 +2754,36 @@
     </w:tbl>
     <w:p/>
     <w:p>
-      <w:pPr>
-        <w:pStyle w:val="Heading1"/>
-      </w:pPr>
       <w:r>
-        <w:t>7. Situacao no Cronograma</w:t>
+        <w:rPr>
+          <w:b/>
+          <w:color w:val="2C3E50"/>
+          <w:sz w:val="26"/>
+        </w:rPr>
+        <w:t>9. Situacao no Cronograma</w:t>
       </w:r>
     </w:p>
     <w:tbl>
       <w:tblPr>
         <w:tblStyle w:val="LightGrid-Accent1"/>
         <w:tblW w:type="auto" w:w="0"/>
-        <w:jc w:val="center"/>
         <w:tblLook w:firstColumn="1" w:firstRow="1" w:lastColumn="0" w:lastRow="0" w:noHBand="0" w:noVBand="1" w:val="04A0"/>
       </w:tblPr>
       <w:tblGrid>
-        <w:gridCol w:w="1728"/>
-        <w:gridCol w:w="1728"/>
-        <w:gridCol w:w="1728"/>
-        <w:gridCol w:w="1728"/>
-        <w:gridCol w:w="1728"/>
+        <w:gridCol w:w="2351"/>
+        <w:gridCol w:w="2351"/>
+        <w:gridCol w:w="2351"/>
+        <w:gridCol w:w="2351"/>
       </w:tblGrid>
       <w:tr>
         <w:tc>
           <w:tcPr>
-            <w:tcW w:type="dxa" w:w="1728"/>
+            <w:tcW w:type="dxa" w:w="2351"/>
           </w:tcPr>
           <w:p>
-            <w:r/>
             <w:r>
               <w:rPr>
-                <w:rFonts w:ascii="Arial" w:hAnsi="Arial"/>
                 <w:b/>
-                <w:sz w:val="20"/>
               </w:rPr>
               <w:t>Data</w:t>
             </w:r>
@@ -2292,15 +2791,12 @@
         </w:tc>
         <w:tc>
           <w:tcPr>
-            <w:tcW w:type="dxa" w:w="1728"/>
+            <w:tcW w:type="dxa" w:w="2351"/>
           </w:tcPr>
           <w:p>
-            <w:r/>
             <w:r>
               <w:rPr>
-                <w:rFonts w:ascii="Arial" w:hAnsi="Arial"/>
                 <w:b/>
-                <w:sz w:val="20"/>
               </w:rPr>
               <w:t>Fase</w:t>
             </w:r>
@@ -2308,15 +2804,12 @@
         </w:tc>
         <w:tc>
           <w:tcPr>
-            <w:tcW w:type="dxa" w:w="1728"/>
+            <w:tcW w:type="dxa" w:w="2351"/>
           </w:tcPr>
           <w:p>
-            <w:r/>
             <w:r>
               <w:rPr>
-                <w:rFonts w:ascii="Arial" w:hAnsi="Arial"/>
                 <w:b/>
-                <w:sz w:val="20"/>
               </w:rPr>
               <w:t>Acao</w:t>
             </w:r>
@@ -2324,31 +2817,12 @@
         </w:tc>
         <w:tc>
           <w:tcPr>
-            <w:tcW w:type="dxa" w:w="1728"/>
+            <w:tcW w:type="dxa" w:w="2351"/>
           </w:tcPr>
           <w:p>
-            <w:r/>
             <w:r>
               <w:rPr>
-                <w:rFonts w:ascii="Arial" w:hAnsi="Arial"/>
                 <w:b/>
-                <w:sz w:val="20"/>
-              </w:rPr>
-              <w:t>Responsavel</w:t>
-            </w:r>
-          </w:p>
-        </w:tc>
-        <w:tc>
-          <w:tcPr>
-            <w:tcW w:type="dxa" w:w="1728"/>
-          </w:tcPr>
-          <w:p>
-            <w:r/>
-            <w:r>
-              <w:rPr>
-                <w:rFonts w:ascii="Arial" w:hAnsi="Arial"/>
-                <w:b/>
-                <w:sz w:val="20"/>
               </w:rPr>
               <w:t>Status</w:t>
             </w:r>
@@ -2358,75 +2832,40 @@
       <w:tr>
         <w:tc>
           <w:tcPr>
-            <w:tcW w:type="dxa" w:w="1728"/>
+            <w:tcW w:type="dxa" w:w="2351"/>
           </w:tcPr>
           <w:p>
-            <w:r/>
             <w:r>
-              <w:rPr>
-                <w:rFonts w:ascii="Arial" w:hAnsi="Arial"/>
-                <w:sz w:val="20"/>
-              </w:rPr>
               <w:t>03/03</w:t>
             </w:r>
           </w:p>
         </w:tc>
         <w:tc>
           <w:tcPr>
-            <w:tcW w:type="dxa" w:w="1728"/>
+            <w:tcW w:type="dxa" w:w="2351"/>
           </w:tcPr>
           <w:p>
-            <w:r/>
             <w:r>
-              <w:rPr>
-                <w:rFonts w:ascii="Arial" w:hAnsi="Arial"/>
-                <w:sz w:val="20"/>
-              </w:rPr>
               <w:t>Pesquisa</w:t>
             </w:r>
           </w:p>
         </w:tc>
         <w:tc>
           <w:tcPr>
-            <w:tcW w:type="dxa" w:w="1728"/>
+            <w:tcW w:type="dxa" w:w="2351"/>
           </w:tcPr>
           <w:p>
-            <w:r/>
             <w:r>
-              <w:rPr>
-                <w:rFonts w:ascii="Arial" w:hAnsi="Arial"/>
-                <w:sz w:val="20"/>
-              </w:rPr>
               <w:t>Levantamento de Requisitos</w:t>
             </w:r>
           </w:p>
         </w:tc>
         <w:tc>
           <w:tcPr>
-            <w:tcW w:type="dxa" w:w="1728"/>
+            <w:tcW w:type="dxa" w:w="2351"/>
           </w:tcPr>
           <w:p>
-            <w:r/>
             <w:r>
-              <w:rPr>
-                <w:rFonts w:ascii="Arial" w:hAnsi="Arial"/>
-                <w:sz w:val="20"/>
-              </w:rPr>
-              <w:t>Todos</w:t>
-            </w:r>
-          </w:p>
-        </w:tc>
-        <w:tc>
-          <w:tcPr>
-            <w:tcW w:type="dxa" w:w="1728"/>
-          </w:tcPr>
-          <w:p>
-            <w:r/>
-            <w:r>
-              <w:rPr>
-                <w:rFonts w:ascii="Arial" w:hAnsi="Arial"/>
-                <w:sz w:val="20"/>
-              </w:rPr>
               <w:t>Concluido</w:t>
             </w:r>
           </w:p>
@@ -2435,76 +2874,41 @@
       <w:tr>
         <w:tc>
           <w:tcPr>
-            <w:tcW w:type="dxa" w:w="1728"/>
+            <w:tcW w:type="dxa" w:w="2351"/>
           </w:tcPr>
           <w:p>
-            <w:r/>
             <w:r>
-              <w:rPr>
-                <w:rFonts w:ascii="Arial" w:hAnsi="Arial"/>
-                <w:sz w:val="20"/>
-              </w:rPr>
               <w:t>10/03</w:t>
             </w:r>
           </w:p>
         </w:tc>
         <w:tc>
           <w:tcPr>
-            <w:tcW w:type="dxa" w:w="1728"/>
+            <w:tcW w:type="dxa" w:w="2351"/>
           </w:tcPr>
           <w:p>
-            <w:r/>
             <w:r>
-              <w:rPr>
-                <w:rFonts w:ascii="Arial" w:hAnsi="Arial"/>
-                <w:sz w:val="20"/>
-              </w:rPr>
               <w:t>Arquitetura</w:t>
             </w:r>
           </w:p>
         </w:tc>
         <w:tc>
           <w:tcPr>
-            <w:tcW w:type="dxa" w:w="1728"/>
+            <w:tcW w:type="dxa" w:w="2351"/>
           </w:tcPr>
           <w:p>
-            <w:r/>
             <w:r>
-              <w:rPr>
-                <w:rFonts w:ascii="Arial" w:hAnsi="Arial"/>
-                <w:sz w:val="20"/>
-              </w:rPr>
               <w:t>Diagramas UML e estrutura inicial</w:t>
             </w:r>
           </w:p>
         </w:tc>
         <w:tc>
           <w:tcPr>
-            <w:tcW w:type="dxa" w:w="1728"/>
+            <w:tcW w:type="dxa" w:w="2351"/>
           </w:tcPr>
           <w:p>
-            <w:r/>
             <w:r>
-              <w:rPr>
-                <w:rFonts w:ascii="Arial" w:hAnsi="Arial"/>
-                <w:sz w:val="20"/>
-              </w:rPr>
-              <w:t>Diego / Pedro</w:t>
-            </w:r>
-          </w:p>
-        </w:tc>
-        <w:tc>
-          <w:tcPr>
-            <w:tcW w:type="dxa" w:w="1728"/>
-          </w:tcPr>
-          <w:p>
-            <w:r/>
-            <w:r>
-              <w:rPr>
-                <w:rFonts w:ascii="Arial" w:hAnsi="Arial"/>
-                <w:sz w:val="20"/>
-              </w:rPr>
-              <w:t>Parcial (estrutura feita, diagramas pendentes)</w:t>
+              <w:t>Parcial (estrutura feita)</w:t>
             </w:r>
           </w:p>
         </w:tc>
@@ -2512,152 +2916,40 @@
       <w:tr>
         <w:tc>
           <w:tcPr>
-            <w:tcW w:type="dxa" w:w="1728"/>
+            <w:tcW w:type="dxa" w:w="2351"/>
           </w:tcPr>
           <w:p>
-            <w:r/>
             <w:r>
-              <w:rPr>
-                <w:rFonts w:ascii="Arial" w:hAnsi="Arial"/>
-                <w:sz w:val="20"/>
-              </w:rPr>
               <w:t>17/03</w:t>
             </w:r>
           </w:p>
         </w:tc>
         <w:tc>
           <w:tcPr>
-            <w:tcW w:type="dxa" w:w="1728"/>
+            <w:tcW w:type="dxa" w:w="2351"/>
           </w:tcPr>
           <w:p>
-            <w:r/>
             <w:r>
-              <w:rPr>
-                <w:rFonts w:ascii="Arial" w:hAnsi="Arial"/>
-                <w:sz w:val="20"/>
-              </w:rPr>
               <w:t>Arquitetura</w:t>
             </w:r>
           </w:p>
         </w:tc>
         <w:tc>
           <w:tcPr>
-            <w:tcW w:type="dxa" w:w="1728"/>
+            <w:tcW w:type="dxa" w:w="2351"/>
           </w:tcPr>
           <w:p>
-            <w:r/>
             <w:r>
-              <w:rPr>
-                <w:rFonts w:ascii="Arial" w:hAnsi="Arial"/>
-                <w:sz w:val="20"/>
-              </w:rPr>
               <w:t>Modelos do banco e conexao</w:t>
             </w:r>
           </w:p>
         </w:tc>
         <w:tc>
           <w:tcPr>
-            <w:tcW w:type="dxa" w:w="1728"/>
+            <w:tcW w:type="dxa" w:w="2351"/>
           </w:tcPr>
           <w:p>
-            <w:r/>
             <w:r>
-              <w:rPr>
-                <w:rFonts w:ascii="Arial" w:hAnsi="Arial"/>
-                <w:sz w:val="20"/>
-              </w:rPr>
-              <w:t>Gabriela / Pedro</w:t>
-            </w:r>
-          </w:p>
-        </w:tc>
-        <w:tc>
-          <w:tcPr>
-            <w:tcW w:type="dxa" w:w="1728"/>
-          </w:tcPr>
-          <w:p>
-            <w:r/>
-            <w:r>
-              <w:rPr>
-                <w:rFonts w:ascii="Arial" w:hAnsi="Arial"/>
-                <w:sz w:val="20"/>
-              </w:rPr>
-              <w:t>Parcial (modelo JPA feito, DER pendente)</w:t>
-            </w:r>
-          </w:p>
-        </w:tc>
-      </w:tr>
-      <w:tr>
-        <w:tc>
-          <w:tcPr>
-            <w:tcW w:type="dxa" w:w="1728"/>
-          </w:tcPr>
-          <w:p>
-            <w:r/>
-            <w:r>
-              <w:rPr>
-                <w:rFonts w:ascii="Arial" w:hAnsi="Arial"/>
-                <w:sz w:val="20"/>
-              </w:rPr>
-              <w:t>31/03</w:t>
-            </w:r>
-          </w:p>
-        </w:tc>
-        <w:tc>
-          <w:tcPr>
-            <w:tcW w:type="dxa" w:w="1728"/>
-          </w:tcPr>
-          <w:p>
-            <w:r/>
-            <w:r>
-              <w:rPr>
-                <w:rFonts w:ascii="Arial" w:hAnsi="Arial"/>
-                <w:sz w:val="20"/>
-              </w:rPr>
-              <w:t>Desenvolvimento</w:t>
-            </w:r>
-          </w:p>
-        </w:tc>
-        <w:tc>
-          <w:tcPr>
-            <w:tcW w:type="dxa" w:w="1728"/>
-          </w:tcPr>
-          <w:p>
-            <w:r/>
-            <w:r>
-              <w:rPr>
-                <w:rFonts w:ascii="Arial" w:hAnsi="Arial"/>
-                <w:sz w:val="20"/>
-              </w:rPr>
-              <w:t>APIs e regras de negocio</w:t>
-            </w:r>
-          </w:p>
-        </w:tc>
-        <w:tc>
-          <w:tcPr>
-            <w:tcW w:type="dxa" w:w="1728"/>
-          </w:tcPr>
-          <w:p>
-            <w:r/>
-            <w:r>
-              <w:rPr>
-                <w:rFonts w:ascii="Arial" w:hAnsi="Arial"/>
-                <w:sz w:val="20"/>
-              </w:rPr>
-              <w:t>Pedro</w:t>
-            </w:r>
-          </w:p>
-        </w:tc>
-        <w:tc>
-          <w:tcPr>
-            <w:tcW w:type="dxa" w:w="1728"/>
-          </w:tcPr>
-          <w:p>
-            <w:r/>
-            <w:r>
-              <w:rPr>
-                <w:rFonts w:ascii="Arial" w:hAnsi="Arial"/>
-                <w:sz w:val="20"/>
-              </w:rPr>
               <w:t>Concluido</w:t>
             </w:r>
           </w:p>
@@ -2666,76 +2958,41 @@
       <w:tr>
         <w:tc>
           <w:tcPr>
-            <w:tcW w:type="dxa" w:w="1728"/>
+            <w:tcW w:type="dxa" w:w="2351"/>
           </w:tcPr>
           <w:p>
-            <w:r/>
             <w:r>
-              <w:rPr>
-                <w:rFonts w:ascii="Arial" w:hAnsi="Arial"/>
-                <w:sz w:val="20"/>
-              </w:rPr>
-              <w:t>14/04</w:t>
+              <w:t>31/03</w:t>
             </w:r>
           </w:p>
         </w:tc>
         <w:tc>
           <w:tcPr>
-            <w:tcW w:type="dxa" w:w="1728"/>
+            <w:tcW w:type="dxa" w:w="2351"/>
           </w:tcPr>
           <w:p>
-            <w:r/>
             <w:r>
-              <w:rPr>
-                <w:rFonts w:ascii="Arial" w:hAnsi="Arial"/>
-                <w:sz w:val="20"/>
-              </w:rPr>
-              <w:t>Teste</w:t>
+              <w:t>Desenvolvimento</w:t>
             </w:r>
           </w:p>
         </w:tc>
         <w:tc>
           <w:tcPr>
-            <w:tcW w:type="dxa" w:w="1728"/>
+            <w:tcW w:type="dxa" w:w="2351"/>
           </w:tcPr>
           <w:p>
-            <w:r/>
             <w:r>
-              <w:rPr>
-                <w:rFonts w:ascii="Arial" w:hAnsi="Arial"/>
-                <w:sz w:val="20"/>
-              </w:rPr>
-              <w:t>Testes gerais do sistema</w:t>
+              <w:t>APIs e regras de negocio</w:t>
             </w:r>
           </w:p>
         </w:tc>
         <w:tc>
           <w:tcPr>
-            <w:tcW w:type="dxa" w:w="1728"/>
+            <w:tcW w:type="dxa" w:w="2351"/>
           </w:tcPr>
           <w:p>
-            <w:r/>
             <w:r>
-              <w:rPr>
-                <w:rFonts w:ascii="Arial" w:hAnsi="Arial"/>
-                <w:sz w:val="20"/>
-              </w:rPr>
-              <w:t>Todos</w:t>
-            </w:r>
-          </w:p>
-        </w:tc>
-        <w:tc>
-          <w:tcPr>
-            <w:tcW w:type="dxa" w:w="1728"/>
-          </w:tcPr>
-          <w:p>
-            <w:r/>
-            <w:r>
-              <w:rPr>
-                <w:rFonts w:ascii="Arial" w:hAnsi="Arial"/>
-                <w:sz w:val="20"/>
-              </w:rPr>
-              <w:t>Parcial (testes manuais feitos, automatizados pendentes)</w:t>
+              <w:t>Concluido</w:t>
             </w:r>
           </w:p>
         </w:tc>
@@ -2743,75 +3000,124 @@
       <w:tr>
         <w:tc>
           <w:tcPr>
-            <w:tcW w:type="dxa" w:w="1728"/>
+            <w:tcW w:type="dxa" w:w="2351"/>
           </w:tcPr>
           <w:p>
-            <w:r/>
             <w:r>
-              <w:rPr>
-                <w:rFonts w:ascii="Arial" w:hAnsi="Arial"/>
-                <w:sz w:val="20"/>
-              </w:rPr>
+              <w:t>14/04</w:t>
+            </w:r>
+          </w:p>
+        </w:tc>
+        <w:tc>
+          <w:tcPr>
+            <w:tcW w:type="dxa" w:w="2351"/>
+          </w:tcPr>
+          <w:p>
+            <w:r>
+              <w:t>Teste</w:t>
+            </w:r>
+          </w:p>
+        </w:tc>
+        <w:tc>
+          <w:tcPr>
+            <w:tcW w:type="dxa" w:w="2351"/>
+          </w:tcPr>
+          <w:p>
+            <w:r>
+              <w:t>Testes gerais do sistema</w:t>
+            </w:r>
+          </w:p>
+        </w:tc>
+        <w:tc>
+          <w:tcPr>
+            <w:tcW w:type="dxa" w:w="2351"/>
+          </w:tcPr>
+          <w:p>
+            <w:r>
+              <w:t>Parcial (manuais feitos)</w:t>
+            </w:r>
+          </w:p>
+        </w:tc>
+      </w:tr>
+      <w:tr>
+        <w:tc>
+          <w:tcPr>
+            <w:tcW w:type="dxa" w:w="2351"/>
+          </w:tcPr>
+          <w:p>
+            <w:r>
+              <w:t>28/04</w:t>
+            </w:r>
+          </w:p>
+        </w:tc>
+        <w:tc>
+          <w:tcPr>
+            <w:tcW w:type="dxa" w:w="2351"/>
+          </w:tcPr>
+          <w:p>
+            <w:r>
+              <w:t>Integracao</w:t>
+            </w:r>
+          </w:p>
+        </w:tc>
+        <w:tc>
+          <w:tcPr>
+            <w:tcW w:type="dxa" w:w="2351"/>
+          </w:tcPr>
+          <w:p>
+            <w:r>
+              <w:t>Consolidacao das entregas individuais</w:t>
+            </w:r>
+          </w:p>
+        </w:tc>
+        <w:tc>
+          <w:tcPr>
+            <w:tcW w:type="dxa" w:w="2351"/>
+          </w:tcPr>
+          <w:p>
+            <w:r>
+              <w:t>Concluido</w:t>
+            </w:r>
+          </w:p>
+        </w:tc>
+      </w:tr>
+      <w:tr>
+        <w:tc>
+          <w:tcPr>
+            <w:tcW w:type="dxa" w:w="2351"/>
+          </w:tcPr>
+          <w:p>
+            <w:r>
               <w:t>12/05</w:t>
             </w:r>
           </w:p>
         </w:tc>
         <w:tc>
           <w:tcPr>
-            <w:tcW w:type="dxa" w:w="1728"/>
+            <w:tcW w:type="dxa" w:w="2351"/>
           </w:tcPr>
           <w:p>
-            <w:r/>
             <w:r>
-              <w:rPr>
-                <w:rFonts w:ascii="Arial" w:hAnsi="Arial"/>
-                <w:sz w:val="20"/>
-              </w:rPr>
               <w:t>Homologacao</w:t>
             </w:r>
           </w:p>
         </w:tc>
         <w:tc>
           <w:tcPr>
-            <w:tcW w:type="dxa" w:w="1728"/>
+            <w:tcW w:type="dxa" w:w="2351"/>
           </w:tcPr>
           <w:p>
-            <w:r/>
             <w:r>
-              <w:rPr>
-                <w:rFonts w:ascii="Arial" w:hAnsi="Arial"/>
-                <w:sz w:val="20"/>
-              </w:rPr>
-              <w:t>Validacao e documentacao</w:t>
+              <w:t>Validacao e documentacao final</w:t>
             </w:r>
           </w:p>
         </w:tc>
         <w:tc>
           <w:tcPr>
-            <w:tcW w:type="dxa" w:w="1728"/>
+            <w:tcW w:type="dxa" w:w="2351"/>
           </w:tcPr>
           <w:p>
-            <w:r/>
             <w:r>
-              <w:rPr>
-                <w:rFonts w:ascii="Arial" w:hAnsi="Arial"/>
-                <w:sz w:val="20"/>
-              </w:rPr>
-              <w:t>Todos</w:t>
-            </w:r>
-          </w:p>
-        </w:tc>
-        <w:tc>
-          <w:tcPr>
-            <w:tcW w:type="dxa" w:w="1728"/>
-          </w:tcPr>
-          <w:p>
-            <w:r/>
-            <w:r>
-              <w:rPr>
-                <w:rFonts w:ascii="Arial" w:hAnsi="Arial"/>
-                <w:sz w:val="20"/>
-              </w:rPr>
               <w:t>Em andamento</w:t>
             </w:r>
           </w:p>
@@ -2820,75 +3126,40 @@
       <w:tr>
         <w:tc>
           <w:tcPr>
-            <w:tcW w:type="dxa" w:w="1728"/>
+            <w:tcW w:type="dxa" w:w="2351"/>
           </w:tcPr>
           <w:p>
-            <w:r/>
             <w:r>
-              <w:rPr>
-                <w:rFonts w:ascii="Arial" w:hAnsi="Arial"/>
-                <w:sz w:val="20"/>
-              </w:rPr>
               <w:t>19/05</w:t>
             </w:r>
           </w:p>
         </w:tc>
         <w:tc>
           <w:tcPr>
-            <w:tcW w:type="dxa" w:w="1728"/>
+            <w:tcW w:type="dxa" w:w="2351"/>
           </w:tcPr>
           <w:p>
-            <w:r/>
             <w:r>
-              <w:rPr>
-                <w:rFonts w:ascii="Arial" w:hAnsi="Arial"/>
-                <w:sz w:val="20"/>
-              </w:rPr>
-              <w:t>Final</w:t>
+              <w:t>Apresentacao</w:t>
             </w:r>
           </w:p>
         </w:tc>
         <w:tc>
           <w:tcPr>
-            <w:tcW w:type="dxa" w:w="1728"/>
+            <w:tcW w:type="dxa" w:w="2351"/>
           </w:tcPr>
           <w:p>
-            <w:r/>
             <w:r>
-              <w:rPr>
-                <w:rFonts w:ascii="Arial" w:hAnsi="Arial"/>
-                <w:sz w:val="20"/>
-              </w:rPr>
               <w:t>Apresentacao do projeto</w:t>
             </w:r>
           </w:p>
         </w:tc>
         <w:tc>
           <w:tcPr>
-            <w:tcW w:type="dxa" w:w="1728"/>
+            <w:tcW w:type="dxa" w:w="2351"/>
           </w:tcPr>
           <w:p>
-            <w:r/>
             <w:r>
-              <w:rPr>
-                <w:rFonts w:ascii="Arial" w:hAnsi="Arial"/>
-                <w:sz w:val="20"/>
-              </w:rPr>
-              <w:t>Todos</w:t>
-            </w:r>
-          </w:p>
-        </w:tc>
-        <w:tc>
-          <w:tcPr>
-            <w:tcW w:type="dxa" w:w="1728"/>
-          </w:tcPr>
-          <w:p>
-            <w:r/>
-            <w:r>
-              <w:rPr>
-                <w:rFonts w:ascii="Arial" w:hAnsi="Arial"/>
-                <w:sz w:val="20"/>
-              </w:rPr>
               <w:t>Pendente</w:t>
             </w:r>
           </w:p>
@@ -2897,26 +3168,63 @@
     </w:tbl>
     <w:p/>
     <w:p>
-      <w:pPr>
-        <w:pStyle w:val="Heading1"/>
-      </w:pPr>
       <w:r>
-        <w:t>8. Conclusao</w:t>
+        <w:rPr>
+          <w:b/>
+          <w:color w:val="2C3E50"/>
+          <w:sz w:val="26"/>
+        </w:rPr>
+        <w:t>10. Conclusao</w:t>
       </w:r>
     </w:p>
     <w:p>
+      <w:pPr>
+        <w:jc w:val="both"/>
+      </w:pPr>
       <w:r>
-        <w:t>O backend do sistema esta funcional e completo, com todas as APIs REST operacionais, autenticacao implementada, servico de precificacao inteligente e banco de dados configurado com dados iniciais. O sistema pode ser executado localmente e testado por meio de qualquer ferramenta de requisicoes HTTP (Postman, Insomnia, navegador).</w:t>
+        <w:rPr>
+          <w:b w:val="0"/>
+        </w:rPr>
+        <w:t>O sistema TransLog encontra-se funcional e integrado, com o backend completo (9 controllers REST, 8 entidades JPA, autenticacao e regras de negocio), banco de dados estruturado (modelagem da Gabriela refinada para 8 tabelas) e frontend operacional (SPA com identidade visual definida pelo Diego). As regras de negocio do modulo de Logistica descritas pelo Leonardo foram incorporadas ao ViagemController, e o servico de precificacao do Vinicius esta implementado no FreteService.</w:t>
       </w:r>
     </w:p>
     <w:p>
+      <w:pPr>
+        <w:jc w:val="both"/>
+      </w:pPr>
       <w:r>
-        <w:t>As pendencias restantes da minha parte sao documentais (diagramas UML e DER), que dependem de alinhamento com os colegas Diego e Gabriela respectivamente, e a preparacao da apresentacao final prevista para 19/05/2026.</w:t>
+        <w:rPr>
+          <w:b w:val="0"/>
+        </w:rPr>
+        <w:t>A integracao realizada em 28/04/2026 garantiu que cada entrega individual dos integrantes esteja literal e visivelmente representada no codigo-fonte, com rastreabilidade documental atraves de comentarios, cabecalhos de arquivos e artefatos historicos preservados em docs/. As pendencias restantes sao principalmente documentais (diagramas UML, DER formal, slides) e o relatorio do Vinicius, que precisa ser cobrado para fechamento da Etapa 2.</w:t>
+      </w:r>
+    </w:p>
+    <w:p/>
+    <w:p>
+      <w:pPr>
+        <w:jc w:val="both"/>
+      </w:pPr>
+      <w:r>
+        <w:rPr>
+          <w:b/>
+        </w:rPr>
+        <w:t>Pedro Henrique Alves Marcandali - RA 20241595</w:t>
+      </w:r>
+    </w:p>
+    <w:p>
+      <w:pPr>
+        <w:jc w:val="both"/>
+      </w:pPr>
+      <w:r>
+        <w:rPr>
+          <w:b w:val="0"/>
+        </w:rPr>
+        <w:t>Americana, 28 de abril de 2026.</w:t>
       </w:r>
     </w:p>
     <w:sectPr>
       <w:pgSz w:w="12240" w:h="15840"/>
-      <w:pgMar w:top="1440" w:right="1800" w:bottom="1440" w:left="1800" w:header="720" w:footer="720" w:gutter="0"/>
+      <w:pgMar w:top="1417" w:right="1417" w:bottom="1417" w:left="1417" w:header="720" w:footer="720" w:gutter="0"/>
       <w:cols w:space="720"/>
       <w:docGrid w:linePitch="360"/>
     </w:sectPr>
@@ -3287,12 +3595,9 @@
     <w:name w:val="Normal"/>
     <w:qFormat/>
     <w:rsid w:val="00FC693F"/>
-    <w:pPr>
-      <w:spacing w:after="120" w:line="360" w:lineRule="auto"/>
-    </w:pPr>
     <w:rPr>
-      <w:rFonts w:ascii="Arial" w:hAnsi="Arial"/>
-      <w:sz w:val="24"/>
+      <w:rFonts w:ascii="Calibri" w:hAnsi="Calibri"/>
+      <w:sz w:val="22"/>
     </w:rPr>
   </w:style>
   <w:style w:type="paragraph" w:styleId="Header">
@@ -3354,11 +3659,11 @@
       <w:outlineLvl w:val="0"/>
     </w:pPr>
     <w:rPr>
-      <w:rFonts w:asciiTheme="majorHAnsi" w:eastAsiaTheme="majorEastAsia" w:hAnsiTheme="majorHAnsi" w:cstheme="majorBidi" w:ascii="Arial" w:hAnsi="Arial"/>
+      <w:rFonts w:asciiTheme="majorHAnsi" w:eastAsiaTheme="majorEastAsia" w:hAnsiTheme="majorHAnsi" w:cstheme="majorBidi"/>
       <w:b/>
       <w:bCs/>
-      <w:color w:val="003366"/>
-      <w:sz w:val="32"/>
+      <w:color w:val="365F91" w:themeColor="accent1" w:themeShade="BF"/>
+      <w:sz w:val="28"/>
       <w:szCs w:val="28"/>
     </w:rPr>
   </w:style>
@@ -3378,10 +3683,10 @@
       <w:outlineLvl w:val="1"/>
     </w:pPr>
     <w:rPr>
-      <w:rFonts w:asciiTheme="majorHAnsi" w:eastAsiaTheme="majorEastAsia" w:hAnsiTheme="majorHAnsi" w:cstheme="majorBidi" w:ascii="Arial" w:hAnsi="Arial"/>
+      <w:rFonts w:asciiTheme="majorHAnsi" w:eastAsiaTheme="majorEastAsia" w:hAnsiTheme="majorHAnsi" w:cstheme="majorBidi"/>
       <w:b/>
       <w:bCs/>
-      <w:color w:val="003366"/>
+      <w:color w:val="4F81BD" w:themeColor="accent1"/>
       <w:sz w:val="26"/>
       <w:szCs w:val="26"/>
     </w:rPr>
@@ -3402,10 +3707,10 @@
       <w:outlineLvl w:val="2"/>
     </w:pPr>
     <w:rPr>
-      <w:rFonts w:asciiTheme="majorHAnsi" w:eastAsiaTheme="majorEastAsia" w:hAnsiTheme="majorHAnsi" w:cstheme="majorBidi" w:ascii="Arial" w:hAnsi="Arial"/>
+      <w:rFonts w:asciiTheme="majorHAnsi" w:eastAsiaTheme="majorEastAsia" w:hAnsiTheme="majorHAnsi" w:cstheme="majorBidi"/>
       <w:b/>
       <w:bCs/>
-      <w:color w:val="003366"/>
+      <w:color w:val="4F81BD" w:themeColor="accent1"/>
     </w:rPr>
   </w:style>
   <w:style w:type="paragraph" w:styleId="Heading4">

</xml_diff>